<commit_message>
docs: synchronize dactausecase.docx and BAO_CAO report docx with codebase and use cases
</commit_message>
<xml_diff>
--- a/docs/report/BAO_CAO_DO_AN_CONG_NGHE_PHAN_MEM_SGU.docx
+++ b/docs/report/BAO_CAO_DO_AN_CONG_NGHE_PHAN_MEM_SGU.docx
@@ -853,21 +853,7 @@
         <w:jc w:val="both"/>
       </w:pPr>
       <w:r>
-        <w:rPr>
-          <w:rFonts w:ascii="Times New Roman" w:hAnsi="Times New Roman"/>
-          <w:b/>
-          <w:color w:val="212529"/>
-          <w:sz w:val="26"/>
-        </w:rPr>
-        <w:t xml:space="preserve">Thiếu nhân sự đa ngôn ngữ: </w:t>
-      </w:r>
-      <w:r>
-        <w:rPr>
-          <w:rFonts w:ascii="Times New Roman" w:hAnsi="Times New Roman"/>
-          <w:color w:val="212529"/>
-          <w:sz w:val="26"/>
-        </w:rPr>
-        <w:t>Hạn chế về nguồn nhân lực: Đội ngũ thuyết minh viên thông thạo ngoại ngữ hiếm (tiếng Pháp, tiếng Nhật, tiếng Trung...) rất khan hiếm và không thể phục vụ cùng lúc nhiều đoàn khách vào mùa cao điểm.</w:t>
+        <w:t>Thiếu nhân sự đa ngôn ngữ: Hạn chế về nguồn nhân lực: Đội ngũ thuyết minh viên thông thạo ngoại ngữ hiếm (tiếng Hàn, tiếng Nhật, tiếng Trung...) rất khan hiếm và không thể phục vụ cùng lúc nhiều đoàn khách vào mùa cao điểm.</w:t>
       </w:r>
     </w:p>
     <w:p>
@@ -999,21 +985,7 @@
         <w:jc w:val="both"/>
       </w:pPr>
       <w:r>
-        <w:rPr>
-          <w:rFonts w:ascii="Times New Roman" w:hAnsi="Times New Roman"/>
-          <w:b/>
-          <w:color w:val="212529"/>
-          <w:sz w:val="26"/>
-        </w:rPr>
-        <w:t xml:space="preserve">Hiện thực Front-end chuyên nghiệp: </w:t>
-      </w:r>
-      <w:r>
-        <w:rPr>
-          <w:rFonts w:ascii="Times New Roman" w:hAnsi="Times New Roman"/>
-          <w:color w:val="212529"/>
-          <w:sz w:val="26"/>
-        </w:rPr>
-        <w:t>Về mặt Phát triển Giao diện Front-end: Xây dựng ứng dụng Web SPA hiện đại, hỗ trợ đa nền tảng (Web &amp; Mobile Browser), đáp ứng tiêu chuẩn giao diện người dùng (UI/UX) với 5 ngôn ngữ (Tiếng Việt, Anh, Pháp, Nhật, Trung), tích hợp bộ phát thanh thông minh (Media Player) và công nghệ quét mã QR trực tiếp qua Camera.</w:t>
+        <w:t>Hiện thực Front-end chuyên nghiệp: Về mặt Phát triển Giao diện Front-end: Xây dựng ứng dụng Web SPA hiện đại, hỗ trợ đa nền tảng (Web &amp; Mobile Browser), đáp ứng tiêu chuẩn giao diện người dùng (UI/UX) với 5 ngôn ngữ (Tiếng Việt, Anh, Trung, Hàn, Nhật), tích hợp bộ phát thanh thông minh (Media Player) và công nghệ quét mã QR trực tiếp qua Camera.</w:t>
       </w:r>
     </w:p>
     <w:p>
@@ -1235,13 +1207,13 @@
         <w:jc w:val="both"/>
       </w:pPr>
       <w:r>
-        <w:rPr>
-          <w:rFonts w:ascii="Times New Roman" w:hAnsi="Times New Roman"/>
-          <w:i w:val="0"/>
-          <w:color w:val="212529"/>
-          <w:sz w:val="26"/>
-        </w:rPr>
-        <w:t>Sơ đồ thành phần mô tả cấu trúc phân rã của hệ thống thành các khối module độc lập, giao tiếp với nhau thông qua các cổng giao tiếp chuẩn hóa (Ports) và giao diện lập trình (Interfaces). Kiến trúc được chia thành 3 tầng chính: Client, Server, và Tầng Lưu trữ/Cơ sở dữ liệu.</w:t>
+        <w:t>Sơ đồ thành phần mô tả cấu trúc phân rã của hệ thống thành các khối module độc lập, giao tiếp với nhau thông qua các cổng giao tiếp chuẩn hóa và các Web APIs hiện đại. Hệ thống được tổ chức thành 3 phân hệ chính:</w:t>
+        <w:br/>
+        <w:t>1. Phân hệ Khách tham quan (Visitor Module): VisitorLayout, TrackingPanel (định vị lai QR &amp; GPS), AudioPlayerBar &amp; Subtitles, FloorMapView (bản đồ đa tầng &amp; pin "Bạn đang ở đây"), ExploreView (tìm kiếm &amp; lọc), ArtifactDetailView.</w:t>
+        <w:br/>
+        <w:t>2. Phân hệ Quản trị (Admin Module): AdminLoginView (bảo mật khóa 5 phút khi sai 5 lần), AdminDashboard, ArtifactsManageView (CRUD hiện vật, cấu hình tọa độ GPS &amp; bán kính kích hoạt), SessionsManageView (quản lý phiên &amp; xuất mã QR đón tiếp).</w:t>
+        <w:br/>
+        <w:t>3. Phân hệ Shared Core &amp; Dịch vụ ngoại vi: geofence.ts (Haversine &amp; Proximity), qrHelper.ts, loginLock.ts, api.ts, các Zustand stores, Hạ tầng GitHub Pages CDN (phân phối tệp tĩnh HTML/JS/CSS, âm thanh MP3, ảnh sơ đồ) và ntfy.sh Telemetry Gateway.</w:t>
       </w:r>
     </w:p>
     <w:p>
@@ -1490,13 +1462,13 @@
         <w:jc w:val="both"/>
       </w:pPr>
       <w:r>
-        <w:rPr>
-          <w:rFonts w:ascii="Times New Roman" w:hAnsi="Times New Roman"/>
-          <w:i w:val="0"/>
-          <w:color w:val="212529"/>
-          <w:sz w:val="26"/>
-        </w:rPr>
-        <w:t>Sơ đồ triển khai xác định cách thức các thành phần phần mềm được đóng gói và phân bổ trên các nút phần cứng thực tế, cùng với các giao thức mạng giao tiếp giữa các nút.</w:t>
+        <w:t>Sơ đồ triển khai xác định môi trường thực thi và hạ tầng mạng thực tế của hệ thống:</w:t>
+        <w:br/>
+        <w:t>1. Nút Thiết bị Người dùng (Client Device - Mobile / Desktop): Môi trường Modern Web Browser (Chrome, Safari, Edge, Firefox), thực thi gói ứng dụng Vite React SPA, tận dụng trực tiếp HTML5 Web Audio API, HTML5 Geolocation API, HTML5 Camera API và Browser LocalStorage.</w:t>
+        <w:br/>
+        <w:t>2. Nút Hạ tầng Lưu trữ &amp; Phân phối (GitHub Pages CDN): Máy chủ Static Web Server Nginx với bảo mật HTTPS :443, phân phối toàn cầu bản dựng dist/, tệp thuyết minh audio MP3 và ảnh sơ đồ các tầng với tốc độ cao và độ trễ thấp.</w:t>
+        <w:br/>
+        <w:t>3. Nút Hạ tầng Giám sát Telemetry (ntfy.sh Gateway): Máy chủ HTTPS Push Gateway thu thập và đồng bộ các sự kiện thống kê lượt nghe theo thời gian thực.</w:t>
       </w:r>
     </w:p>
     <w:p>
@@ -3925,25 +3897,10 @@
             </w:tcMar>
           </w:tcPr>
           <w:p>
-            <w:pPr>
-              <w:spacing w:before="0" w:after="0" w:line="288" w:lineRule="auto"/>
-              <w:jc w:val="both"/>
-            </w:pPr>
             <w:r>
-              <w:rPr>
-                <w:rFonts w:ascii="Times New Roman" w:hAnsi="Times New Roman"/>
-                <w:color w:val="212529"/>
-                <w:sz w:val="22"/>
-              </w:rPr>
-              <w:t xml:space="preserve">● E1 - Tài khoản không tồn tại: Hệ thống thông báo "Tài khoản </w:t>
+              <w:t>● E1 - Sai mật khẩu hoặc tài khoản không tồn tại: Hệ thống thông báo lỗi và cho phép nhập lại.</w:t>
               <w:br/>
-              <w:t xml:space="preserve">không tồn tại trên hệ thống" và quay lại bước 1. </w:t>
-              <w:br/>
-              <w:t xml:space="preserve">● E2 - Sai mật khẩu: Hệ thống thông báo "Tên đăng nhập hoặc mật </w:t>
-              <w:br/>
-              <w:t xml:space="preserve">khẩu không chính xác" và cho phép nhập lại (tự động khóa tạm thời </w:t>
-              <w:br/>
-              <w:t>nếu nhập sai quá 5 lần).</w:t>
+              <w:t>● E2 - Chống tấn công dò mật khẩu (Brute-Force): Nếu nhập sai quá 5 lần liên tiếp, hệ thống tự động khóa tạm thời 5 phút kèm đồng hồ đếm ngược trên giao diện.</w:t>
             </w:r>
           </w:p>
         </w:tc>
@@ -4000,17 +3957,10 @@
             </w:tcMar>
           </w:tcPr>
           <w:p>
-            <w:pPr>
-              <w:spacing w:before="0" w:after="0" w:line="288" w:lineRule="auto"/>
-              <w:jc w:val="both"/>
-            </w:pPr>
             <w:r>
-              <w:rPr>
-                <w:rFonts w:ascii="Times New Roman" w:hAnsi="Times New Roman"/>
-                <w:color w:val="212529"/>
-                <w:sz w:val="22"/>
-              </w:rPr>
-              <w:t>● Thành công: Phiên làm việc (Session/Token) được khởi tạo thành công với quyền hạn tương ứng (Admin truy cập Dashboard Quản trị; Người dùng truy cập Trang cá nhân). ● Thất bại: Hệ thống từ chối quyền truy cập, hiển thị thông báo lỗi (E1, E2) và không tạo phiên làm việc.</w:t>
+              <w:t>● Thành công: Phiên làm việc (Session/Token) được khởi tạo thành công với quyền hạn tương ứng (Admin truy cập Dashboard Quản trị; khách vãng lai sử dụng trực tiếp các tính năng thuyết minh không cần đăng nhập).</w:t>
+              <w:br/>
+              <w:t>● Thất bại: Hệ thống từ chối truy cập và hiển thị thông báo lỗi.</w:t>
             </w:r>
           </w:p>
         </w:tc>
@@ -4654,17 +4604,8 @@
             </w:tcMar>
           </w:tcPr>
           <w:p>
-            <w:pPr>
-              <w:spacing w:before="0" w:after="0" w:line="288" w:lineRule="auto"/>
-              <w:jc w:val="both"/>
-            </w:pPr>
             <w:r>
-              <w:rPr>
-                <w:rFonts w:ascii="Times New Roman" w:hAnsi="Times New Roman"/>
-                <w:color w:val="212529"/>
-                <w:sz w:val="22"/>
-              </w:rPr>
-              <w:t>Người dùng sử dụng camera thiết bị di động quét mã QR gắn tại vị trí hiện vật/khu vực trưng bày để hệ thống tự động nhận diện và mở nội dung thuyết minh tương ứng.</w:t>
+              <w:t>Người dùng sử dụng camera quét mã QR tại cổng hoặc gắn tại hiện vật để mở nội dung thuyết minh. Đồng thời, hệ thống ghi nhận mã QR làm mốc neo xuất phát (anchorArtifactId) và tự động kích hoạt chế độ GPS theo dõi độ chính xác cao, tự động nhận diện và gợi ý phát thuyết minh khi đến gần các hiện vật tiếp theo mà không cần quét lại.</w:t>
             </w:r>
           </w:p>
         </w:tc>
@@ -6801,17 +6742,8 @@
             </w:tcMar>
           </w:tcPr>
           <w:p>
-            <w:pPr>
-              <w:spacing w:before="0" w:after="0" w:line="288" w:lineRule="auto"/>
-              <w:jc w:val="both"/>
-            </w:pPr>
             <w:r>
-              <w:rPr>
-                <w:rFonts w:ascii="Times New Roman" w:hAnsi="Times New Roman"/>
-                <w:color w:val="212529"/>
-                <w:sz w:val="22"/>
-              </w:rPr>
-              <w:t>Thay đổi ngôn ngữ hiển thị giao diện và ngôn ngữ các nội dung thuyết minh (Tiếng Việt, Tiếng Anh, Tiếng Pháp, Tiếng Trung, v.v.).</w:t>
+              <w:t>Thay đổi ngôn ngữ hiển thị giao diện và ngôn ngữ các nội dung thuyết minh (Tiếng Việt, Tiếng Anh, Tiếng Hàn, Tiếng Trung, v.v.).</w:t>
             </w:r>
           </w:p>
         </w:tc>
@@ -7790,17 +7722,8 @@
             </w:tcMar>
           </w:tcPr>
           <w:p>
-            <w:pPr>
-              <w:spacing w:before="0" w:after="0" w:line="288" w:lineRule="auto"/>
-              <w:jc w:val="both"/>
-            </w:pPr>
             <w:r>
-              <w:rPr>
-                <w:rFonts w:ascii="Times New Roman" w:hAnsi="Times New Roman"/>
-                <w:color w:val="212529"/>
-                <w:sz w:val="22"/>
-              </w:rPr>
-              <w:t>Người dùng đang ở màn hình chi tiết hiện vật và đã đăng nhập (nếu chưa đăng nhập, include {Đăng Nhập}).</w:t>
+              <w:t>Người dùng đang ở màn hình chi tiết hiện vật (không yêu cầu đăng nhập tài khoản).</w:t>
             </w:r>
           </w:p>
         </w:tc>
@@ -7993,17 +7916,8 @@
             </w:tcMar>
           </w:tcPr>
           <w:p>
-            <w:pPr>
-              <w:spacing w:before="0" w:after="0" w:line="288" w:lineRule="auto"/>
-              <w:jc w:val="both"/>
-            </w:pPr>
             <w:r>
-              <w:rPr>
-                <w:rFonts w:ascii="Times New Roman" w:hAnsi="Times New Roman"/>
-                <w:color w:val="212529"/>
-                <w:sz w:val="22"/>
-              </w:rPr>
-              <w:t>Hiện vật được thêm vào danh sách yêu thích của tài khoản người dùng.</w:t>
+              <w:t>Hiện vật được thêm vào danh sách yêu thích lưu trữ cục bộ trên thiết bị của người dùng (LocalStorage).</w:t>
             </w:r>
           </w:p>
         </w:tc>
@@ -23065,44 +22979,51 @@
         <w:jc w:val="left"/>
       </w:pPr>
       <w:r>
-        <w:rPr>
-          <w:rFonts w:ascii="Consolas" w:hAnsi="Consolas"/>
-          <w:color w:val="1A5276"/>
-          <w:sz w:val="19"/>
-        </w:rPr>
-        <w:t>frontend/</w:t>
+        <w:t>Do_an_CNPM/</w:t>
         <w:br/>
-        <w:t>├── index.html                   # Trang chủ Single-Page Application (SPA)</w:t>
+        <w:t>├── index.html                   # Điểm khởi nhập HTML Single-Page Application (SPA)</w:t>
         <w:br/>
-        <w:t>├── README.md                    # Tài liệu hướng dẫn cài đặt &amp; vận hành</w:t>
+        <w:t>├── package.json                 # Cấu hình dự án React 18, TypeScript, Tailwind CSS, Vite</w:t>
+        <w:br/>
+        <w:t>├── vite.config.ts               # Thiết lập pipeline build tối ưu hóa và đường dẫn alias</w:t>
+        <w:br/>
+        <w:t>├── public/                      # Thư mục tài nguyên tĩnh phân phối qua Web CDN</w:t>
+        <w:br/>
+        <w:t>│   ├── audio/                   # 15 tệp âm thanh thuyết minh MP3 thời lượng thực tế</w:t>
+        <w:br/>
+        <w:t>│   ├── images/                  # Sơ đồ bản đồ 4 khu vực (ngoài trời, trệt, lầu 1, lầu 2)</w:t>
+        <w:br/>
+        <w:t>│   └── mock/museum_data.json    # Dữ liệu hiện vật chuẩn có tọa độ GPS &amp; bán kính kích hoạt</w:t>
         <w:br/>
         <w:t>└── src/</w:t>
         <w:br/>
-        <w:t xml:space="preserve">    ├── app.js                   # Điểm khởi nhập chính (Main Controller)</w:t>
+        <w:t xml:space="preserve">    ├── visitor/                 # Phân hệ giao diện khách tham quan</w:t>
         <w:br/>
-        <w:t xml:space="preserve">    ├── bundle.js                # Bản đóng gói phân phối độc lập</w:t>
+        <w:t xml:space="preserve">    │   ├── VisitorLayout.tsx    # Bộ điều hướng chung, kích hoạt QR &amp; GPS tracking</w:t>
         <w:br/>
-        <w:t xml:space="preserve">    ├── components/              # Các khối giao diện tương tác độc lập</w:t>
+        <w:t xml:space="preserve">    │   ├── components/          # TrackingPanel, AudioPlayerBar, SubtitleOverlay</w:t>
         <w:br/>
-        <w:t xml:space="preserve">    │   ├── AdminDashboard.js    # Bảng điều khiển quản trị, CRUD hiện vật &amp; biểu đồ</w:t>
+        <w:t xml:space="preserve">    │   └── views/               # FloorMapView (halo định vị), ExploreView, ArtifactDetailView</w:t>
         <w:br/>
-        <w:t xml:space="preserve">    │   ├── AuthModal.js         # Hộp thoại Modal Đăng ký, Đăng nhập, Quên mật khẩu</w:t>
+        <w:t xml:space="preserve">    ├── admin/                   # Phân hệ giao diện quản trị viên</w:t>
         <w:br/>
-        <w:t xml:space="preserve">    │   ├── PlayerBar.js         # Thanh công cụ phát âm thanh nổi ghim đáy màn hình</w:t>
+        <w:t xml:space="preserve">    │   ├── AdminLayout.tsx      # Khung điều hướng Dashboard quản trị</w:t>
         <w:br/>
-        <w:t xml:space="preserve">    │   └── QRScanner.js         # Giao diện camera quét mã QR và giải mã trực tiếp</w:t>
+        <w:t xml:space="preserve">    │   └── views/               # AdminLoginView (khóa 5 lần), ArtifactsManageView, SessionsManageView</w:t>
         <w:br/>
-        <w:t xml:space="preserve">    └── services/                # Các dịch vụ xử lý logic và dữ liệu</w:t>
+        <w:t xml:space="preserve">    ├── shared/                  # Lớp dịch vụ, tiện ích và kho trạng thái dùng chung</w:t>
         <w:br/>
-        <w:t xml:space="preserve">        ├── ArtifactService.js   # Xử lý nghiệp vụ tra cứu, tìm kiếm, yêu thích hiện vật</w:t>
+        <w:t xml:space="preserve">    │   ├── utils/               # geofence.ts (Haversine &amp; Proximity), qrHelper.ts, loginLock.ts</w:t>
         <w:br/>
-        <w:t xml:space="preserve">        ├── ClientSession.js     # Quản lý Token, phiên đăng nhập, quyền hạn Actor</w:t>
+        <w:t xml:space="preserve">    │   ├── stores/              # geofenceStore, playerStore, langStore, favoritesStore</w:t>
         <w:br/>
-        <w:t xml:space="preserve">        ├── I18nService.js       # Dịch vụ đa ngôn ngữ phản ứng (5 thứ tiếng)</w:t>
+        <w:t xml:space="preserve">    │   ├── services/            # api.ts (mock DB + LocalStorage), tts.ts, audioService.ts</w:t>
         <w:br/>
-        <w:t xml:space="preserve">        ├── MediaPlayer.js       # Bộ máy điều khiển Audio HTML5 &amp; Streaming</w:t>
+        <w:t xml:space="preserve">    │   └── types/               # Định nghĩa kiểu dữ liệu TypeScript (Artifact, Floor, Session)</w:t>
         <w:br/>
-        <w:t xml:space="preserve">        └── MockDatabase.js      # Giả lập CSDL quan hệ lưu trữ dữ liệu hoàn chỉnh</w:t>
+        <w:t xml:space="preserve">    ├── locales/i18n.ts          # Từ điển phản ứng 5 ngôn ngữ (vi, en, zh, ko, ja)</w:t>
+        <w:br/>
+        <w:t xml:space="preserve">    └── __tests__/               # Bộ kiểm thử tự động (21 tests: geofence, qr, login, audio)</w:t>
       </w:r>
     </w:p>
     <w:p>
@@ -23262,126 +23183,41 @@
       <w:tr>
         <w:tc>
           <w:tcPr>
-            <w:tcW w:type="dxa" w:w="2268"/>
-            <w:shd w:fill="FFFFFF"/>
-            <w:tcBorders>
-              <w:top w:val="single" w:sz="4" w:space="0" w:color="B0C4DE"/>
-              <w:bottom w:val="single" w:sz="4" w:space="0" w:color="B0C4DE"/>
-              <w:left w:val="none" w:sz="4" w:space="0" w:color="B0C4DE"/>
-              <w:right w:val="none" w:sz="4" w:space="0" w:color="B0C4DE"/>
-            </w:tcBorders>
-            <w:tcMar>
-              <w:top w:w="80" w:type="dxa"/>
-              <w:bottom w:w="80" w:type="dxa"/>
-              <w:left w:w="100" w:type="dxa"/>
-              <w:right w:w="100" w:type="dxa"/>
-            </w:tcMar>
+            <w:tcW w:type="dxa" w:w="2016"/>
           </w:tcPr>
           <w:p>
-            <w:pPr>
-              <w:spacing w:before="0" w:after="0" w:line="276" w:lineRule="auto"/>
-              <w:jc w:val="left"/>
-            </w:pPr>
             <w:r>
-              <w:rPr>
-                <w:rFonts w:ascii="Times New Roman" w:hAnsi="Times New Roman"/>
-                <w:sz w:val="20"/>
-              </w:rPr>
               <w:t>Component Diagram</w:t>
             </w:r>
           </w:p>
         </w:tc>
         <w:tc>
           <w:tcPr>
-            <w:tcW w:type="dxa" w:w="2268"/>
-            <w:shd w:fill="FFFFFF"/>
-            <w:tcBorders>
-              <w:top w:val="single" w:sz="4" w:space="0" w:color="B0C4DE"/>
-              <w:bottom w:val="single" w:sz="4" w:space="0" w:color="B0C4DE"/>
-              <w:left w:val="none" w:sz="4" w:space="0" w:color="B0C4DE"/>
-              <w:right w:val="none" w:sz="4" w:space="0" w:color="B0C4DE"/>
-            </w:tcBorders>
-            <w:tcMar>
-              <w:top w:w="80" w:type="dxa"/>
-              <w:bottom w:w="80" w:type="dxa"/>
-              <w:left w:w="100" w:type="dxa"/>
-              <w:right w:w="100" w:type="dxa"/>
-            </w:tcMar>
+            <w:tcW w:type="dxa" w:w="2160"/>
           </w:tcPr>
           <w:p>
-            <w:pPr>
-              <w:spacing w:before="0" w:after="0" w:line="276" w:lineRule="auto"/>
-              <w:jc w:val="left"/>
-            </w:pPr>
             <w:r>
-              <w:rPr>
-                <w:rFonts w:ascii="Times New Roman" w:hAnsi="Times New Roman"/>
-                <w:sz w:val="20"/>
-              </w:rPr>
-              <w:t>GUI (Client View)</w:t>
+              <w:t>Phân hệ Khách tham quan</w:t>
             </w:r>
           </w:p>
         </w:tc>
         <w:tc>
           <w:tcPr>
-            <w:tcW w:type="dxa" w:w="2268"/>
-            <w:shd w:fill="FFFFFF"/>
-            <w:tcBorders>
-              <w:top w:val="single" w:sz="4" w:space="0" w:color="B0C4DE"/>
-              <w:bottom w:val="single" w:sz="4" w:space="0" w:color="B0C4DE"/>
-              <w:left w:val="none" w:sz="4" w:space="0" w:color="B0C4DE"/>
-              <w:right w:val="none" w:sz="4" w:space="0" w:color="B0C4DE"/>
-            </w:tcBorders>
-            <w:tcMar>
-              <w:top w:w="80" w:type="dxa"/>
-              <w:bottom w:w="80" w:type="dxa"/>
-              <w:left w:w="100" w:type="dxa"/>
-              <w:right w:w="100" w:type="dxa"/>
-            </w:tcMar>
+            <w:tcW w:type="dxa" w:w="2592"/>
           </w:tcPr>
           <w:p>
-            <w:pPr>
-              <w:spacing w:before="0" w:after="0" w:line="276" w:lineRule="auto"/>
-              <w:jc w:val="left"/>
-            </w:pPr>
             <w:r>
-              <w:rPr>
-                <w:rFonts w:ascii="Consolas" w:hAnsi="Consolas"/>
-                <w:color w:val="003366"/>
-                <w:sz w:val="19"/>
-              </w:rPr>
-              <w:t>index.html &amp; app.js</w:t>
+              <w:t>VisitorLayout.tsx &amp; TrackingPanel.tsx</w:t>
             </w:r>
           </w:p>
         </w:tc>
         <w:tc>
           <w:tcPr>
-            <w:tcW w:type="dxa" w:w="2268"/>
-            <w:shd w:fill="FFFFFF"/>
-            <w:tcBorders>
-              <w:top w:val="single" w:sz="4" w:space="0" w:color="B0C4DE"/>
-              <w:bottom w:val="single" w:sz="4" w:space="0" w:color="B0C4DE"/>
-              <w:left w:val="none" w:sz="4" w:space="0" w:color="B0C4DE"/>
-              <w:right w:val="none" w:sz="4" w:space="0" w:color="B0C4DE"/>
-            </w:tcBorders>
-            <w:tcMar>
-              <w:top w:w="80" w:type="dxa"/>
-              <w:bottom w:w="80" w:type="dxa"/>
-              <w:left w:w="100" w:type="dxa"/>
-              <w:right w:w="100" w:type="dxa"/>
-            </w:tcMar>
+            <w:tcW w:type="dxa" w:w="2304"/>
           </w:tcPr>
           <w:p>
-            <w:pPr>
-              <w:spacing w:before="0" w:after="0" w:line="276" w:lineRule="auto"/>
-              <w:jc w:val="left"/>
-            </w:pPr>
             <w:r>
-              <w:rPr>
-                <w:rFonts w:ascii="Times New Roman" w:hAnsi="Times New Roman"/>
-                <w:sz w:val="20"/>
-              </w:rPr>
-              <w:t>Single-Page Application điều phối luồng giao diện</w:t>
+              <w:t>Điều phối luồng ứng dụng, quét QR deep link và kích hoạt GPS tracking</w:t>
             </w:r>
           </w:p>
         </w:tc>
@@ -23389,126 +23225,41 @@
       <w:tr>
         <w:tc>
           <w:tcPr>
-            <w:tcW w:type="dxa" w:w="2268"/>
-            <w:shd w:fill="F8FAFC"/>
-            <w:tcBorders>
-              <w:top w:val="single" w:sz="4" w:space="0" w:color="B0C4DE"/>
-              <w:bottom w:val="single" w:sz="4" w:space="0" w:color="B0C4DE"/>
-              <w:left w:val="none" w:sz="4" w:space="0" w:color="B0C4DE"/>
-              <w:right w:val="none" w:sz="4" w:space="0" w:color="B0C4DE"/>
-            </w:tcBorders>
-            <w:tcMar>
-              <w:top w:w="80" w:type="dxa"/>
-              <w:bottom w:w="80" w:type="dxa"/>
-              <w:left w:w="100" w:type="dxa"/>
-              <w:right w:w="100" w:type="dxa"/>
-            </w:tcMar>
+            <w:tcW w:type="dxa" w:w="2016"/>
           </w:tcPr>
           <w:p>
-            <w:pPr>
-              <w:spacing w:before="0" w:after="0" w:line="276" w:lineRule="auto"/>
-              <w:jc w:val="left"/>
-            </w:pPr>
             <w:r>
-              <w:rPr>
-                <w:rFonts w:ascii="Times New Roman" w:hAnsi="Times New Roman"/>
-                <w:sz w:val="20"/>
-              </w:rPr>
               <w:t>Component Diagram</w:t>
             </w:r>
           </w:p>
         </w:tc>
         <w:tc>
           <w:tcPr>
-            <w:tcW w:type="dxa" w:w="2268"/>
-            <w:shd w:fill="F8FAFC"/>
-            <w:tcBorders>
-              <w:top w:val="single" w:sz="4" w:space="0" w:color="B0C4DE"/>
-              <w:bottom w:val="single" w:sz="4" w:space="0" w:color="B0C4DE"/>
-              <w:left w:val="none" w:sz="4" w:space="0" w:color="B0C4DE"/>
-              <w:right w:val="none" w:sz="4" w:space="0" w:color="B0C4DE"/>
-            </w:tcBorders>
-            <w:tcMar>
-              <w:top w:w="80" w:type="dxa"/>
-              <w:bottom w:w="80" w:type="dxa"/>
-              <w:left w:w="100" w:type="dxa"/>
-              <w:right w:w="100" w:type="dxa"/>
-            </w:tcMar>
+            <w:tcW w:type="dxa" w:w="2160"/>
           </w:tcPr>
           <w:p>
-            <w:pPr>
-              <w:spacing w:before="0" w:after="0" w:line="276" w:lineRule="auto"/>
-              <w:jc w:val="left"/>
-            </w:pPr>
             <w:r>
-              <w:rPr>
-                <w:rFonts w:ascii="Times New Roman" w:hAnsi="Times New Roman"/>
-                <w:sz w:val="20"/>
-              </w:rPr>
-              <w:t>Client Session</w:t>
+              <w:t>Bản đồ tương tác &amp; Định vị</w:t>
             </w:r>
           </w:p>
         </w:tc>
         <w:tc>
           <w:tcPr>
-            <w:tcW w:type="dxa" w:w="2268"/>
-            <w:shd w:fill="F8FAFC"/>
-            <w:tcBorders>
-              <w:top w:val="single" w:sz="4" w:space="0" w:color="B0C4DE"/>
-              <w:bottom w:val="single" w:sz="4" w:space="0" w:color="B0C4DE"/>
-              <w:left w:val="none" w:sz="4" w:space="0" w:color="B0C4DE"/>
-              <w:right w:val="none" w:sz="4" w:space="0" w:color="B0C4DE"/>
-            </w:tcBorders>
-            <w:tcMar>
-              <w:top w:w="80" w:type="dxa"/>
-              <w:bottom w:w="80" w:type="dxa"/>
-              <w:left w:w="100" w:type="dxa"/>
-              <w:right w:w="100" w:type="dxa"/>
-            </w:tcMar>
+            <w:tcW w:type="dxa" w:w="2592"/>
           </w:tcPr>
           <w:p>
-            <w:pPr>
-              <w:spacing w:before="0" w:after="0" w:line="276" w:lineRule="auto"/>
-              <w:jc w:val="left"/>
-            </w:pPr>
             <w:r>
-              <w:rPr>
-                <w:rFonts w:ascii="Consolas" w:hAnsi="Consolas"/>
-                <w:color w:val="003366"/>
-                <w:sz w:val="19"/>
-              </w:rPr>
-              <w:t>ClientSession.js</w:t>
+              <w:t>FloorMapView.tsx &amp; geofence.ts</w:t>
             </w:r>
           </w:p>
         </w:tc>
         <w:tc>
           <w:tcPr>
-            <w:tcW w:type="dxa" w:w="2268"/>
-            <w:shd w:fill="F8FAFC"/>
-            <w:tcBorders>
-              <w:top w:val="single" w:sz="4" w:space="0" w:color="B0C4DE"/>
-              <w:bottom w:val="single" w:sz="4" w:space="0" w:color="B0C4DE"/>
-              <w:left w:val="none" w:sz="4" w:space="0" w:color="B0C4DE"/>
-              <w:right w:val="none" w:sz="4" w:space="0" w:color="B0C4DE"/>
-            </w:tcBorders>
-            <w:tcMar>
-              <w:top w:w="80" w:type="dxa"/>
-              <w:bottom w:w="80" w:type="dxa"/>
-              <w:left w:w="100" w:type="dxa"/>
-              <w:right w:w="100" w:type="dxa"/>
-            </w:tcMar>
+            <w:tcW w:type="dxa" w:w="2304"/>
           </w:tcPr>
           <w:p>
-            <w:pPr>
-              <w:spacing w:before="0" w:after="0" w:line="276" w:lineRule="auto"/>
-              <w:jc w:val="left"/>
-            </w:pPr>
             <w:r>
-              <w:rPr>
-                <w:rFonts w:ascii="Times New Roman" w:hAnsi="Times New Roman"/>
-                <w:sz w:val="20"/>
-              </w:rPr>
-              <w:t>Quản lý Token, phiên làm việc qua giao diện I_Auth</w:t>
+              <w:t>Hiển thị sơ đồ 4 tầng, mốc halo "Bạn đang ở đây" và tính khoảng cách Haversine</w:t>
             </w:r>
           </w:p>
         </w:tc>
@@ -23516,126 +23267,41 @@
       <w:tr>
         <w:tc>
           <w:tcPr>
-            <w:tcW w:type="dxa" w:w="2268"/>
-            <w:shd w:fill="FFFFFF"/>
-            <w:tcBorders>
-              <w:top w:val="single" w:sz="4" w:space="0" w:color="B0C4DE"/>
-              <w:bottom w:val="single" w:sz="4" w:space="0" w:color="B0C4DE"/>
-              <w:left w:val="none" w:sz="4" w:space="0" w:color="B0C4DE"/>
-              <w:right w:val="none" w:sz="4" w:space="0" w:color="B0C4DE"/>
-            </w:tcBorders>
-            <w:tcMar>
-              <w:top w:w="80" w:type="dxa"/>
-              <w:bottom w:w="80" w:type="dxa"/>
-              <w:left w:w="100" w:type="dxa"/>
-              <w:right w:w="100" w:type="dxa"/>
-            </w:tcMar>
+            <w:tcW w:type="dxa" w:w="2016"/>
           </w:tcPr>
           <w:p>
-            <w:pPr>
-              <w:spacing w:before="0" w:after="0" w:line="276" w:lineRule="auto"/>
-              <w:jc w:val="left"/>
-            </w:pPr>
             <w:r>
-              <w:rPr>
-                <w:rFonts w:ascii="Times New Roman" w:hAnsi="Times New Roman"/>
-                <w:sz w:val="20"/>
-              </w:rPr>
               <w:t>Component Diagram</w:t>
             </w:r>
           </w:p>
         </w:tc>
         <w:tc>
           <w:tcPr>
-            <w:tcW w:type="dxa" w:w="2268"/>
-            <w:shd w:fill="FFFFFF"/>
-            <w:tcBorders>
-              <w:top w:val="single" w:sz="4" w:space="0" w:color="B0C4DE"/>
-              <w:bottom w:val="single" w:sz="4" w:space="0" w:color="B0C4DE"/>
-              <w:left w:val="none" w:sz="4" w:space="0" w:color="B0C4DE"/>
-              <w:right w:val="none" w:sz="4" w:space="0" w:color="B0C4DE"/>
-            </w:tcBorders>
-            <w:tcMar>
-              <w:top w:w="80" w:type="dxa"/>
-              <w:bottom w:w="80" w:type="dxa"/>
-              <w:left w:w="100" w:type="dxa"/>
-              <w:right w:w="100" w:type="dxa"/>
-            </w:tcMar>
+            <w:tcW w:type="dxa" w:w="2160"/>
           </w:tcPr>
           <w:p>
-            <w:pPr>
-              <w:spacing w:before="0" w:after="0" w:line="276" w:lineRule="auto"/>
-              <w:jc w:val="left"/>
-            </w:pPr>
             <w:r>
-              <w:rPr>
-                <w:rFonts w:ascii="Times New Roman" w:hAnsi="Times New Roman"/>
-                <w:sz w:val="20"/>
-              </w:rPr>
-              <w:t>QR Scanner</w:t>
+              <w:t>Bộ phát âm thanh &amp; Phụ đề</w:t>
             </w:r>
           </w:p>
         </w:tc>
         <w:tc>
           <w:tcPr>
-            <w:tcW w:type="dxa" w:w="2268"/>
-            <w:shd w:fill="FFFFFF"/>
-            <w:tcBorders>
-              <w:top w:val="single" w:sz="4" w:space="0" w:color="B0C4DE"/>
-              <w:bottom w:val="single" w:sz="4" w:space="0" w:color="B0C4DE"/>
-              <w:left w:val="none" w:sz="4" w:space="0" w:color="B0C4DE"/>
-              <w:right w:val="none" w:sz="4" w:space="0" w:color="B0C4DE"/>
-            </w:tcBorders>
-            <w:tcMar>
-              <w:top w:w="80" w:type="dxa"/>
-              <w:bottom w:w="80" w:type="dxa"/>
-              <w:left w:w="100" w:type="dxa"/>
-              <w:right w:w="100" w:type="dxa"/>
-            </w:tcMar>
+            <w:tcW w:type="dxa" w:w="2592"/>
           </w:tcPr>
           <w:p>
-            <w:pPr>
-              <w:spacing w:before="0" w:after="0" w:line="276" w:lineRule="auto"/>
-              <w:jc w:val="left"/>
-            </w:pPr>
             <w:r>
-              <w:rPr>
-                <w:rFonts w:ascii="Consolas" w:hAnsi="Consolas"/>
-                <w:color w:val="003366"/>
-                <w:sz w:val="19"/>
-              </w:rPr>
-              <w:t>QRScanner.js</w:t>
+              <w:t>AudioPlayerBar.tsx &amp; playerStore.ts</w:t>
             </w:r>
           </w:p>
         </w:tc>
         <w:tc>
           <w:tcPr>
-            <w:tcW w:type="dxa" w:w="2268"/>
-            <w:shd w:fill="FFFFFF"/>
-            <w:tcBorders>
-              <w:top w:val="single" w:sz="4" w:space="0" w:color="B0C4DE"/>
-              <w:bottom w:val="single" w:sz="4" w:space="0" w:color="B0C4DE"/>
-              <w:left w:val="none" w:sz="4" w:space="0" w:color="B0C4DE"/>
-              <w:right w:val="none" w:sz="4" w:space="0" w:color="B0C4DE"/>
-            </w:tcBorders>
-            <w:tcMar>
-              <w:top w:w="80" w:type="dxa"/>
-              <w:bottom w:w="80" w:type="dxa"/>
-              <w:left w:w="100" w:type="dxa"/>
-              <w:right w:w="100" w:type="dxa"/>
-            </w:tcMar>
+            <w:tcW w:type="dxa" w:w="2304"/>
           </w:tcPr>
           <w:p>
-            <w:pPr>
-              <w:spacing w:before="0" w:after="0" w:line="276" w:lineRule="auto"/>
-              <w:jc w:val="left"/>
-            </w:pPr>
             <w:r>
-              <w:rPr>
-                <w:rFonts w:ascii="Times New Roman" w:hAnsi="Times New Roman"/>
-                <w:sz w:val="20"/>
-              </w:rPr>
-              <w:t>Camera scanning &amp; đối chiếu chuỗi định danh qua I_Artifact</w:t>
+              <w:t>Phát Web Audio HTML5, đồng bộ phụ đề Karaoke từng giây</w:t>
             </w:r>
           </w:p>
         </w:tc>
@@ -23643,126 +23309,41 @@
       <w:tr>
         <w:tc>
           <w:tcPr>
-            <w:tcW w:type="dxa" w:w="2268"/>
-            <w:shd w:fill="F8FAFC"/>
-            <w:tcBorders>
-              <w:top w:val="single" w:sz="4" w:space="0" w:color="B0C4DE"/>
-              <w:bottom w:val="single" w:sz="4" w:space="0" w:color="B0C4DE"/>
-              <w:left w:val="none" w:sz="4" w:space="0" w:color="B0C4DE"/>
-              <w:right w:val="none" w:sz="4" w:space="0" w:color="B0C4DE"/>
-            </w:tcBorders>
-            <w:tcMar>
-              <w:top w:w="80" w:type="dxa"/>
-              <w:bottom w:w="80" w:type="dxa"/>
-              <w:left w:w="100" w:type="dxa"/>
-              <w:right w:w="100" w:type="dxa"/>
-            </w:tcMar>
+            <w:tcW w:type="dxa" w:w="2016"/>
           </w:tcPr>
           <w:p>
-            <w:pPr>
-              <w:spacing w:before="0" w:after="0" w:line="276" w:lineRule="auto"/>
-              <w:jc w:val="left"/>
-            </w:pPr>
             <w:r>
-              <w:rPr>
-                <w:rFonts w:ascii="Times New Roman" w:hAnsi="Times New Roman"/>
-                <w:sz w:val="20"/>
-              </w:rPr>
               <w:t>Component Diagram</w:t>
             </w:r>
           </w:p>
         </w:tc>
         <w:tc>
           <w:tcPr>
-            <w:tcW w:type="dxa" w:w="2268"/>
-            <w:shd w:fill="F8FAFC"/>
-            <w:tcBorders>
-              <w:top w:val="single" w:sz="4" w:space="0" w:color="B0C4DE"/>
-              <w:bottom w:val="single" w:sz="4" w:space="0" w:color="B0C4DE"/>
-              <w:left w:val="none" w:sz="4" w:space="0" w:color="B0C4DE"/>
-              <w:right w:val="none" w:sz="4" w:space="0" w:color="B0C4DE"/>
-            </w:tcBorders>
-            <w:tcMar>
-              <w:top w:w="80" w:type="dxa"/>
-              <w:bottom w:w="80" w:type="dxa"/>
-              <w:left w:w="100" w:type="dxa"/>
-              <w:right w:w="100" w:type="dxa"/>
-            </w:tcMar>
+            <w:tcW w:type="dxa" w:w="2160"/>
           </w:tcPr>
           <w:p>
-            <w:pPr>
-              <w:spacing w:before="0" w:after="0" w:line="276" w:lineRule="auto"/>
-              <w:jc w:val="left"/>
-            </w:pPr>
             <w:r>
-              <w:rPr>
-                <w:rFonts w:ascii="Times New Roman" w:hAnsi="Times New Roman"/>
-                <w:sz w:val="20"/>
-              </w:rPr>
-              <w:t>Media Player</w:t>
+              <w:t>Tra cứu &amp; Tìm kiếm hiện vật</w:t>
             </w:r>
           </w:p>
         </w:tc>
         <w:tc>
           <w:tcPr>
-            <w:tcW w:type="dxa" w:w="2268"/>
-            <w:shd w:fill="F8FAFC"/>
-            <w:tcBorders>
-              <w:top w:val="single" w:sz="4" w:space="0" w:color="B0C4DE"/>
-              <w:bottom w:val="single" w:sz="4" w:space="0" w:color="B0C4DE"/>
-              <w:left w:val="none" w:sz="4" w:space="0" w:color="B0C4DE"/>
-              <w:right w:val="none" w:sz="4" w:space="0" w:color="B0C4DE"/>
-            </w:tcBorders>
-            <w:tcMar>
-              <w:top w:w="80" w:type="dxa"/>
-              <w:bottom w:w="80" w:type="dxa"/>
-              <w:left w:w="100" w:type="dxa"/>
-              <w:right w:w="100" w:type="dxa"/>
-            </w:tcMar>
+            <w:tcW w:type="dxa" w:w="2592"/>
           </w:tcPr>
           <w:p>
-            <w:pPr>
-              <w:spacing w:before="0" w:after="0" w:line="276" w:lineRule="auto"/>
-              <w:jc w:val="left"/>
-            </w:pPr>
             <w:r>
-              <w:rPr>
-                <w:rFonts w:ascii="Consolas" w:hAnsi="Consolas"/>
-                <w:color w:val="003366"/>
-                <w:sz w:val="19"/>
-              </w:rPr>
-              <w:t>MediaPlayer.js &amp; PlayerBar.js</w:t>
+              <w:t>ExploreView.tsx &amp; ArtifactDetailView.tsx</w:t>
             </w:r>
           </w:p>
         </w:tc>
         <w:tc>
           <w:tcPr>
-            <w:tcW w:type="dxa" w:w="2268"/>
-            <w:shd w:fill="F8FAFC"/>
-            <w:tcBorders>
-              <w:top w:val="single" w:sz="4" w:space="0" w:color="B0C4DE"/>
-              <w:bottom w:val="single" w:sz="4" w:space="0" w:color="B0C4DE"/>
-              <w:left w:val="none" w:sz="4" w:space="0" w:color="B0C4DE"/>
-              <w:right w:val="none" w:sz="4" w:space="0" w:color="B0C4DE"/>
-            </w:tcBorders>
-            <w:tcMar>
-              <w:top w:w="80" w:type="dxa"/>
-              <w:bottom w:w="80" w:type="dxa"/>
-              <w:left w:w="100" w:type="dxa"/>
-              <w:right w:w="100" w:type="dxa"/>
-            </w:tcMar>
+            <w:tcW w:type="dxa" w:w="2304"/>
           </w:tcPr>
           <w:p>
-            <w:pPr>
-              <w:spacing w:before="0" w:after="0" w:line="276" w:lineRule="auto"/>
-              <w:jc w:val="left"/>
-            </w:pPr>
             <w:r>
-              <w:rPr>
-                <w:rFonts w:ascii="Times New Roman" w:hAnsi="Times New Roman"/>
-                <w:sz w:val="20"/>
-              </w:rPr>
-              <w:t>Phát luồng âm thanh, chỉnh tốc độ, phụ đề qua I_Audio</w:t>
+              <w:t>Tìm kiếm đa tiêu chí theo tên, mã số (ART-xxx) và tóm tắt hiện vật</w:t>
             </w:r>
           </w:p>
         </w:tc>
@@ -23770,126 +23351,251 @@
       <w:tr>
         <w:tc>
           <w:tcPr>
-            <w:tcW w:type="dxa" w:w="2268"/>
-            <w:shd w:fill="FFFFFF"/>
-            <w:tcBorders>
-              <w:top w:val="single" w:sz="4" w:space="0" w:color="B0C4DE"/>
-              <w:bottom w:val="single" w:sz="4" w:space="0" w:color="B0C4DE"/>
-              <w:left w:val="none" w:sz="4" w:space="0" w:color="B0C4DE"/>
-              <w:right w:val="none" w:sz="4" w:space="0" w:color="B0C4DE"/>
-            </w:tcBorders>
-            <w:tcMar>
-              <w:top w:w="80" w:type="dxa"/>
-              <w:bottom w:w="80" w:type="dxa"/>
-              <w:left w:w="100" w:type="dxa"/>
-              <w:right w:w="100" w:type="dxa"/>
-            </w:tcMar>
+            <w:tcW w:type="dxa" w:w="2016"/>
           </w:tcPr>
           <w:p>
-            <w:pPr>
-              <w:spacing w:before="0" w:after="0" w:line="276" w:lineRule="auto"/>
-              <w:jc w:val="left"/>
-            </w:pPr>
             <w:r>
-              <w:rPr>
-                <w:rFonts w:ascii="Times New Roman" w:hAnsi="Times New Roman"/>
-                <w:sz w:val="20"/>
-              </w:rPr>
+              <w:t>Component Diagram</w:t>
+            </w:r>
+          </w:p>
+        </w:tc>
+        <w:tc>
+          <w:tcPr>
+            <w:tcW w:type="dxa" w:w="2160"/>
+          </w:tcPr>
+          <w:p>
+            <w:r>
+              <w:t>Quản trị &amp; Bảo mật đăng nhập</w:t>
+            </w:r>
+          </w:p>
+        </w:tc>
+        <w:tc>
+          <w:tcPr>
+            <w:tcW w:type="dxa" w:w="2592"/>
+          </w:tcPr>
+          <w:p>
+            <w:r>
+              <w:t>AdminLoginView.tsx &amp; loginLock.ts</w:t>
+            </w:r>
+          </w:p>
+        </w:tc>
+        <w:tc>
+          <w:tcPr>
+            <w:tcW w:type="dxa" w:w="2304"/>
+          </w:tcPr>
+          <w:p>
+            <w:r>
+              <w:t>Xác thực Admin, chống Brute-force tự động khóa 5 phút khi sai 5 lần</w:t>
+            </w:r>
+          </w:p>
+        </w:tc>
+      </w:tr>
+      <w:tr>
+        <w:tc>
+          <w:tcPr>
+            <w:tcW w:type="dxa" w:w="2016"/>
+          </w:tcPr>
+          <w:p>
+            <w:r>
+              <w:t>Component Diagram</w:t>
+            </w:r>
+          </w:p>
+        </w:tc>
+        <w:tc>
+          <w:tcPr>
+            <w:tcW w:type="dxa" w:w="2160"/>
+          </w:tcPr>
+          <w:p>
+            <w:r>
+              <w:t>Quản trị Hiện vật &amp; Tọa độ</w:t>
+            </w:r>
+          </w:p>
+        </w:tc>
+        <w:tc>
+          <w:tcPr>
+            <w:tcW w:type="dxa" w:w="2592"/>
+          </w:tcPr>
+          <w:p>
+            <w:r>
+              <w:t>ArtifactsManageView.tsx &amp; api.ts</w:t>
+            </w:r>
+          </w:p>
+        </w:tc>
+        <w:tc>
+          <w:tcPr>
+            <w:tcW w:type="dxa" w:w="2304"/>
+          </w:tcPr>
+          <w:p>
+            <w:r>
+              <w:t>CRUD hiện vật, cấu hình tọa độ GPS (geoCoordinates) &amp; bán kính kích hoạt</w:t>
+            </w:r>
+          </w:p>
+        </w:tc>
+      </w:tr>
+      <w:tr>
+        <w:tc>
+          <w:tcPr>
+            <w:tcW w:type="dxa" w:w="2016"/>
+          </w:tcPr>
+          <w:p>
+            <w:r>
+              <w:t>Component Diagram</w:t>
+            </w:r>
+          </w:p>
+        </w:tc>
+        <w:tc>
+          <w:tcPr>
+            <w:tcW w:type="dxa" w:w="2160"/>
+          </w:tcPr>
+          <w:p>
+            <w:r>
+              <w:t>Quản trị Phiên &amp; Xuất mã QR</w:t>
+            </w:r>
+          </w:p>
+        </w:tc>
+        <w:tc>
+          <w:tcPr>
+            <w:tcW w:type="dxa" w:w="2592"/>
+          </w:tcPr>
+          <w:p>
+            <w:r>
+              <w:t>SessionsManageView.tsx</w:t>
+            </w:r>
+          </w:p>
+        </w:tc>
+        <w:tc>
+          <w:tcPr>
+            <w:tcW w:type="dxa" w:w="2304"/>
+          </w:tcPr>
+          <w:p>
+            <w:r>
+              <w:t>Quản lý ca mở cửa, đoàn khách và tạo mã QR đón tiếp tại cổng</w:t>
+            </w:r>
+          </w:p>
+        </w:tc>
+      </w:tr>
+      <w:tr>
+        <w:tc>
+          <w:tcPr>
+            <w:tcW w:type="dxa" w:w="2016"/>
+          </w:tcPr>
+          <w:p>
+            <w:r>
               <w:t>Deploy Diagram</w:t>
             </w:r>
           </w:p>
         </w:tc>
         <w:tc>
           <w:tcPr>
-            <w:tcW w:type="dxa" w:w="2268"/>
-            <w:shd w:fill="FFFFFF"/>
-            <w:tcBorders>
-              <w:top w:val="single" w:sz="4" w:space="0" w:color="B0C4DE"/>
-              <w:bottom w:val="single" w:sz="4" w:space="0" w:color="B0C4DE"/>
-              <w:left w:val="none" w:sz="4" w:space="0" w:color="B0C4DE"/>
-              <w:right w:val="none" w:sz="4" w:space="0" w:color="B0C4DE"/>
-            </w:tcBorders>
-            <w:tcMar>
-              <w:top w:w="80" w:type="dxa"/>
-              <w:bottom w:w="80" w:type="dxa"/>
-              <w:left w:w="100" w:type="dxa"/>
-              <w:right w:w="100" w:type="dxa"/>
-            </w:tcMar>
+            <w:tcW w:type="dxa" w:w="2160"/>
           </w:tcPr>
           <w:p>
-            <w:pPr>
-              <w:spacing w:before="0" w:after="0" w:line="276" w:lineRule="auto"/>
-              <w:jc w:val="left"/>
-            </w:pPr>
             <w:r>
-              <w:rPr>
-                <w:rFonts w:ascii="Times New Roman" w:hAnsi="Times New Roman"/>
-                <w:sz w:val="20"/>
-              </w:rPr>
-              <w:t>Application Server</w:t>
+              <w:t>Nút Thiết bị Khách / Admin</w:t>
             </w:r>
           </w:p>
         </w:tc>
         <w:tc>
           <w:tcPr>
-            <w:tcW w:type="dxa" w:w="2268"/>
-            <w:shd w:fill="FFFFFF"/>
-            <w:tcBorders>
-              <w:top w:val="single" w:sz="4" w:space="0" w:color="B0C4DE"/>
-              <w:bottom w:val="single" w:sz="4" w:space="0" w:color="B0C4DE"/>
-              <w:left w:val="none" w:sz="4" w:space="0" w:color="B0C4DE"/>
-              <w:right w:val="none" w:sz="4" w:space="0" w:color="B0C4DE"/>
-            </w:tcBorders>
-            <w:tcMar>
-              <w:top w:w="80" w:type="dxa"/>
-              <w:bottom w:w="80" w:type="dxa"/>
-              <w:left w:w="100" w:type="dxa"/>
-              <w:right w:w="100" w:type="dxa"/>
-            </w:tcMar>
+            <w:tcW w:type="dxa" w:w="2592"/>
           </w:tcPr>
           <w:p>
-            <w:pPr>
-              <w:spacing w:before="0" w:after="0" w:line="276" w:lineRule="auto"/>
-              <w:jc w:val="left"/>
-            </w:pPr>
             <w:r>
-              <w:rPr>
-                <w:rFonts w:ascii="Consolas" w:hAnsi="Consolas"/>
-                <w:color w:val="003366"/>
-                <w:sz w:val="19"/>
-              </w:rPr>
-              <w:t>MockDatabase.js &amp; ArtifactService.js</w:t>
+              <w:t>Trình duyệt Web (Web APIs)</w:t>
             </w:r>
           </w:p>
         </w:tc>
         <w:tc>
           <w:tcPr>
-            <w:tcW w:type="dxa" w:w="2268"/>
-            <w:shd w:fill="FFFFFF"/>
-            <w:tcBorders>
-              <w:top w:val="single" w:sz="4" w:space="0" w:color="B0C4DE"/>
-              <w:bottom w:val="single" w:sz="4" w:space="0" w:color="B0C4DE"/>
-              <w:left w:val="none" w:sz="4" w:space="0" w:color="B0C4DE"/>
-              <w:right w:val="none" w:sz="4" w:space="0" w:color="B0C4DE"/>
-            </w:tcBorders>
-            <w:tcMar>
-              <w:top w:w="80" w:type="dxa"/>
-              <w:bottom w:w="80" w:type="dxa"/>
-              <w:left w:w="100" w:type="dxa"/>
-              <w:right w:w="100" w:type="dxa"/>
-            </w:tcMar>
+            <w:tcW w:type="dxa" w:w="2304"/>
           </w:tcPr>
           <w:p>
-            <w:pPr>
-              <w:spacing w:before="0" w:after="0" w:line="276" w:lineRule="auto"/>
-              <w:jc w:val="left"/>
-            </w:pPr>
             <w:r>
-              <w:rPr>
-                <w:rFonts w:ascii="Times New Roman" w:hAnsi="Times New Roman"/>
-                <w:sz w:val="20"/>
-              </w:rPr>
-              <w:t>Giả lập AuthServer.jar, ArtifactManager.jar, AudioStreamer.jar</w:t>
+              <w:t>Thực thi SPA, khai thác Camera API, Geolocation API, Web Audio API, LocalStorage</w:t>
+            </w:r>
+          </w:p>
+        </w:tc>
+      </w:tr>
+      <w:tr>
+        <w:tc>
+          <w:tcPr>
+            <w:tcW w:type="dxa" w:w="2016"/>
+          </w:tcPr>
+          <w:p>
+            <w:r>
+              <w:t>Deploy Diagram</w:t>
+            </w:r>
+          </w:p>
+        </w:tc>
+        <w:tc>
+          <w:tcPr>
+            <w:tcW w:type="dxa" w:w="2160"/>
+          </w:tcPr>
+          <w:p>
+            <w:r>
+              <w:t>Hạ tầng Lưu trữ &amp; Phân phối</w:t>
+            </w:r>
+          </w:p>
+        </w:tc>
+        <w:tc>
+          <w:tcPr>
+            <w:tcW w:type="dxa" w:w="2592"/>
+          </w:tcPr>
+          <w:p>
+            <w:r>
+              <w:t>GitHub Pages CDN</w:t>
+            </w:r>
+          </w:p>
+        </w:tc>
+        <w:tc>
+          <w:tcPr>
+            <w:tcW w:type="dxa" w:w="2304"/>
+          </w:tcPr>
+          <w:p>
+            <w:r>
+              <w:t>Nginx CDN phân phối gói tĩnh HTML/CSS/JS, MP3 audio và hình ảnh sơ đồ</w:t>
+            </w:r>
+          </w:p>
+        </w:tc>
+      </w:tr>
+      <w:tr>
+        <w:tc>
+          <w:tcPr>
+            <w:tcW w:type="dxa" w:w="2016"/>
+          </w:tcPr>
+          <w:p>
+            <w:r>
+              <w:t>Deploy Diagram</w:t>
+            </w:r>
+          </w:p>
+        </w:tc>
+        <w:tc>
+          <w:tcPr>
+            <w:tcW w:type="dxa" w:w="2160"/>
+          </w:tcPr>
+          <w:p>
+            <w:r>
+              <w:t>Hạ tầng Giám sát Telemetry</w:t>
+            </w:r>
+          </w:p>
+        </w:tc>
+        <w:tc>
+          <w:tcPr>
+            <w:tcW w:type="dxa" w:w="2592"/>
+          </w:tcPr>
+          <w:p>
+            <w:r>
+              <w:t>ntfy.sh Gateway</w:t>
+            </w:r>
+          </w:p>
+        </w:tc>
+        <w:tc>
+          <w:tcPr>
+            <w:tcW w:type="dxa" w:w="2304"/>
+          </w:tcPr>
+          <w:p>
+            <w:r>
+              <w:t>Thu thập sự kiện thống kê lượt nghe và phiên tham quan qua HTTPS POST</w:t>
             </w:r>
           </w:p>
         </w:tc>
@@ -23935,21 +23641,7 @@
         <w:jc w:val="both"/>
       </w:pPr>
       <w:r>
-        <w:rPr>
-          <w:rFonts w:ascii="Times New Roman" w:hAnsi="Times New Roman"/>
-          <w:b/>
-          <w:color w:val="212529"/>
-          <w:sz w:val="26"/>
-        </w:rPr>
-        <w:t xml:space="preserve">Cơ chế Đa ngôn ngữ Phản ứng (i18n): </w:t>
-      </w:r>
-      <w:r>
-        <w:rPr>
-          <w:rFonts w:ascii="Times New Roman" w:hAnsi="Times New Roman"/>
-          <w:color w:val="212529"/>
-          <w:sz w:val="26"/>
-        </w:rPr>
-        <w:t>Hỗ trợ 5 ngôn ngữ quốc tế: Tiếng Việt, Tiếng Anh (English), Tiếng Pháp (Français), Tiếng Nhật (日本語), Tiếng Trung (中文). Chuyển đổi ngôn ngữ tức thời không tải lại trang.</w:t>
+        <w:t>Cơ chế Đa ngôn ngữ Phản ứng (i18n): Hỗ trợ trọn vẹn 5 ngôn ngữ quốc tế: Tiếng Việt, Tiếng Anh (English), Tiếng Trung (中文), Tiếng Hàn (한국어), Tiếng Nhật (日本語). Chuyển đổi ngôn ngữ tức thời không cần tải lại trang với cơ chế đồng bộ phụ đề và thuyết minh tương ứng.</w:t>
       </w:r>
     </w:p>
     <w:p>
@@ -23985,21 +23677,7 @@
         <w:jc w:val="both"/>
       </w:pPr>
       <w:r>
-        <w:rPr>
-          <w:rFonts w:ascii="Times New Roman" w:hAnsi="Times New Roman"/>
-          <w:b/>
-          <w:color w:val="212529"/>
-          <w:sz w:val="26"/>
-        </w:rPr>
-        <w:t xml:space="preserve">Quét mã QR Code Thông minh: </w:t>
-      </w:r>
-      <w:r>
-        <w:rPr>
-          <w:rFonts w:ascii="Times New Roman" w:hAnsi="Times New Roman"/>
-          <w:color w:val="212529"/>
-          <w:sz w:val="26"/>
-        </w:rPr>
-        <w:t>Tích hợp thư viện quét mã bằng HTML5 Canvas, nhận diện mã QR hiện vật tức thời; có chế độ tra cứu nhanh bằng mã định danh (như ART_art_001) trong môi trường thử nghiệm máy bàn.</w:t>
+        <w:t>Định vị Thông minh kết hợp QR &amp; GPS (Hybrid Geofencing Tracking): Quét mã QR tại cổng hoặc hiện vật làm mốc neo xuất phát (anchorArtifactId), tự động kích hoạt GPS độ chính xác cao (enableHighAccuracy). Hệ thống tính toán khoảng cách Haversine thực tế tới các hiện vật, tự động nhận diện hiện vật trong bán kính 12m, hiển thị pin halo xanh "Bạn đang ở đây" trên bản đồ tầng và đưa ra gợi ý chuyển bài thuyết minh mượt mà khi di chuyển.</w:t>
       </w:r>
     </w:p>
     <w:p>
@@ -24010,21 +23688,7 @@
         <w:jc w:val="both"/>
       </w:pPr>
       <w:r>
-        <w:rPr>
-          <w:rFonts w:ascii="Times New Roman" w:hAnsi="Times New Roman"/>
-          <w:b/>
-          <w:color w:val="212529"/>
-          <w:sz w:val="26"/>
-        </w:rPr>
-        <w:t xml:space="preserve">Hệ thống Xác thực &amp; Phân quyền: </w:t>
-      </w:r>
-      <w:r>
-        <w:rPr>
-          <w:rFonts w:ascii="Times New Roman" w:hAnsi="Times New Roman"/>
-          <w:color w:val="212529"/>
-          <w:sz w:val="26"/>
-        </w:rPr>
-        <w:t>Bảo mật mật khẩu, chống Brute-Force (tự động khóa tài khoản sau 5 lần nhập sai), phân quyền Actor chặt chẽ và quy trình khôi phục mật khẩu qua mã OTP 6 chữ số.</w:t>
+        <w:t>Hệ thống Bảo mật Xác thực &amp; Chống Brute-Force: Bảo mật tài khoản Quản trị bằng cơ chế mã hóa mật khẩu, tự động đếm số lần đăng nhập sai và kích hoạt khóa tạm thời 5 phút khi sai quá 5 lần liên tiếp (kèm đồng hồ đếm ngược). Khách tham quan được tối ưu hóa trải nghiệm tối đa, lưu trữ hiện vật yêu thích trực tiếp qua LocalStorage mà không cần tạo tài khoản.</w:t>
       </w:r>
     </w:p>
     <w:p>
@@ -24035,21 +23699,7 @@
         <w:jc w:val="both"/>
       </w:pPr>
       <w:r>
-        <w:rPr>
-          <w:rFonts w:ascii="Times New Roman" w:hAnsi="Times New Roman"/>
-          <w:b/>
-          <w:color w:val="212529"/>
-          <w:sz w:val="26"/>
-        </w:rPr>
-        <w:t xml:space="preserve">Bảng điều khiển Quản trị (Admin Panel): </w:t>
-      </w:r>
-      <w:r>
-        <w:rPr>
-          <w:rFonts w:ascii="Times New Roman" w:hAnsi="Times New Roman"/>
-          <w:color w:val="212529"/>
-          <w:sz w:val="26"/>
-        </w:rPr>
-        <w:t>Bảng điều khiển cho phép Admin thêm, sửa, xóa hiện vật trực tiếp; sinh mã QR động và tải ảnh PNG; theo dõi biểu đồ lượt nghe và tỷ lệ ngôn ngữ trực quan.</w:t>
+        <w:t>Bảng điều khiển Quản trị Toàn diện (Admin Panel): Cho phép Quản trị viên thêm, sửa, xóa hiện vật trực tiếp; cấu hình tọa độ GPS địa lý (vĩ độ, kinh độ) và bán kính kích hoạt (triggerRadius); quản lý các ca mở cửa/phiên tham quan; tự động xuất mã QR cổng đón tiếp và mã QR hiện vật; theo dõi biểu đồ thống kê lượt nghe theo phiên và ngôn ngữ trực quan.</w:t>
       </w:r>
     </w:p>
     <w:p>
@@ -24331,127 +23981,41 @@
       <w:tr>
         <w:tc>
           <w:tcPr>
-            <w:tcW w:type="dxa" w:w="2268"/>
-            <w:shd w:fill="FFFFFF"/>
-            <w:tcBorders>
-              <w:top w:val="single" w:sz="4" w:space="0" w:color="B0C4DE"/>
-              <w:bottom w:val="single" w:sz="4" w:space="0" w:color="B0C4DE"/>
-              <w:left w:val="none" w:sz="4" w:space="0" w:color="B0C4DE"/>
-              <w:right w:val="none" w:sz="4" w:space="0" w:color="B0C4DE"/>
-            </w:tcBorders>
-            <w:tcMar>
-              <w:top w:w="80" w:type="dxa"/>
-              <w:bottom w:w="80" w:type="dxa"/>
-              <w:left w:w="100" w:type="dxa"/>
-              <w:right w:w="100" w:type="dxa"/>
-            </w:tcMar>
+            <w:tcW w:type="dxa" w:w="1584"/>
           </w:tcPr>
           <w:p>
-            <w:pPr>
-              <w:spacing w:before="0" w:after="0" w:line="276" w:lineRule="auto"/>
-              <w:jc w:val="center"/>
-            </w:pPr>
             <w:r>
-              <w:rPr>
-                <w:rFonts w:ascii="Times New Roman" w:hAnsi="Times New Roman"/>
-                <w:sz w:val="20"/>
-              </w:rPr>
               <w:t>TC_01</w:t>
             </w:r>
           </w:p>
         </w:tc>
         <w:tc>
           <w:tcPr>
-            <w:tcW w:type="dxa" w:w="2268"/>
-            <w:shd w:fill="FFFFFF"/>
-            <w:tcBorders>
-              <w:top w:val="single" w:sz="4" w:space="0" w:color="B0C4DE"/>
-              <w:bottom w:val="single" w:sz="4" w:space="0" w:color="B0C4DE"/>
-              <w:left w:val="none" w:sz="4" w:space="0" w:color="B0C4DE"/>
-              <w:right w:val="none" w:sz="4" w:space="0" w:color="B0C4DE"/>
-            </w:tcBorders>
-            <w:tcMar>
-              <w:top w:w="80" w:type="dxa"/>
-              <w:bottom w:w="80" w:type="dxa"/>
-              <w:left w:w="100" w:type="dxa"/>
-              <w:right w:w="100" w:type="dxa"/>
-            </w:tcMar>
+            <w:tcW w:type="dxa" w:w="2592"/>
           </w:tcPr>
           <w:p>
-            <w:pPr>
-              <w:spacing w:before="0" w:after="0" w:line="276" w:lineRule="auto"/>
-              <w:jc w:val="left"/>
-            </w:pPr>
             <w:r>
-              <w:rPr>
-                <w:rFonts w:ascii="Times New Roman" w:hAnsi="Times New Roman"/>
-                <w:sz w:val="20"/>
-              </w:rPr>
-              <w:t>USC01 - Đăng Ký</w:t>
+              <w:t>USC01 - Đăng Nhập &amp; Khóa bảo mật</w:t>
             </w:r>
           </w:p>
         </w:tc>
         <w:tc>
           <w:tcPr>
-            <w:tcW w:type="dxa" w:w="2268"/>
-            <w:shd w:fill="FFFFFF"/>
-            <w:tcBorders>
-              <w:top w:val="single" w:sz="4" w:space="0" w:color="B0C4DE"/>
-              <w:bottom w:val="single" w:sz="4" w:space="0" w:color="B0C4DE"/>
-              <w:left w:val="none" w:sz="4" w:space="0" w:color="B0C4DE"/>
-              <w:right w:val="none" w:sz="4" w:space="0" w:color="B0C4DE"/>
-            </w:tcBorders>
-            <w:tcMar>
-              <w:top w:w="80" w:type="dxa"/>
-              <w:bottom w:w="80" w:type="dxa"/>
-              <w:left w:w="100" w:type="dxa"/>
-              <w:right w:w="100" w:type="dxa"/>
-            </w:tcMar>
+            <w:tcW w:type="dxa" w:w="3168"/>
           </w:tcPr>
           <w:p>
-            <w:pPr>
-              <w:spacing w:before="0" w:after="0" w:line="276" w:lineRule="auto"/>
-              <w:jc w:val="left"/>
-            </w:pPr>
             <w:r>
-              <w:rPr>
-                <w:rFonts w:ascii="Times New Roman" w:hAnsi="Times New Roman"/>
-                <w:sz w:val="20"/>
-              </w:rPr>
-              <w:t>Nhập thông tin hợp lệ -&gt; Đăng ký tài khoản mới</w:t>
+              <w:t>Nhập sai mật khẩu 5 lần liên tiếp -&gt; Kích hoạt khóa 5 phút</w:t>
             </w:r>
           </w:p>
         </w:tc>
         <w:tc>
           <w:tcPr>
-            <w:tcW w:type="dxa" w:w="2268"/>
-            <w:shd w:fill="FFFFFF"/>
-            <w:tcBorders>
-              <w:top w:val="single" w:sz="4" w:space="0" w:color="B0C4DE"/>
-              <w:bottom w:val="single" w:sz="4" w:space="0" w:color="B0C4DE"/>
-              <w:left w:val="none" w:sz="4" w:space="0" w:color="B0C4DE"/>
-              <w:right w:val="none" w:sz="4" w:space="0" w:color="B0C4DE"/>
-            </w:tcBorders>
-            <w:tcMar>
-              <w:top w:w="80" w:type="dxa"/>
-              <w:bottom w:w="80" w:type="dxa"/>
-              <w:left w:w="100" w:type="dxa"/>
-              <w:right w:w="100" w:type="dxa"/>
-            </w:tcMar>
+            <w:tcW w:type="dxa" w:w="1728"/>
           </w:tcPr>
           <w:p>
-            <w:pPr>
-              <w:spacing w:before="0" w:after="0" w:line="276" w:lineRule="auto"/>
-              <w:jc w:val="center"/>
-            </w:pPr>
             <w:r>
-              <w:rPr>
-                <w:rFonts w:ascii="Times New Roman" w:hAnsi="Times New Roman"/>
-                <w:b/>
-                <w:color w:val="228B22"/>
-                <w:sz w:val="20"/>
-              </w:rPr>
-              <w:t>Thành công (PASS)</w:t>
+              <w:t>Khóa đúng 5 phút, đếm ngược chính xác (PASS) - 4 tests</w:t>
             </w:r>
           </w:p>
         </w:tc>
@@ -24459,127 +24023,41 @@
       <w:tr>
         <w:tc>
           <w:tcPr>
-            <w:tcW w:type="dxa" w:w="2268"/>
-            <w:shd w:fill="F8FAFC"/>
-            <w:tcBorders>
-              <w:top w:val="single" w:sz="4" w:space="0" w:color="B0C4DE"/>
-              <w:bottom w:val="single" w:sz="4" w:space="0" w:color="B0C4DE"/>
-              <w:left w:val="none" w:sz="4" w:space="0" w:color="B0C4DE"/>
-              <w:right w:val="none" w:sz="4" w:space="0" w:color="B0C4DE"/>
-            </w:tcBorders>
-            <w:tcMar>
-              <w:top w:w="80" w:type="dxa"/>
-              <w:bottom w:w="80" w:type="dxa"/>
-              <w:left w:w="100" w:type="dxa"/>
-              <w:right w:w="100" w:type="dxa"/>
-            </w:tcMar>
+            <w:tcW w:type="dxa" w:w="1584"/>
           </w:tcPr>
           <w:p>
-            <w:pPr>
-              <w:spacing w:before="0" w:after="0" w:line="276" w:lineRule="auto"/>
-              <w:jc w:val="center"/>
-            </w:pPr>
             <w:r>
-              <w:rPr>
-                <w:rFonts w:ascii="Times New Roman" w:hAnsi="Times New Roman"/>
-                <w:sz w:val="20"/>
-              </w:rPr>
               <w:t>TC_02</w:t>
             </w:r>
           </w:p>
         </w:tc>
         <w:tc>
           <w:tcPr>
-            <w:tcW w:type="dxa" w:w="2268"/>
-            <w:shd w:fill="F8FAFC"/>
-            <w:tcBorders>
-              <w:top w:val="single" w:sz="4" w:space="0" w:color="B0C4DE"/>
-              <w:bottom w:val="single" w:sz="4" w:space="0" w:color="B0C4DE"/>
-              <w:left w:val="none" w:sz="4" w:space="0" w:color="B0C4DE"/>
-              <w:right w:val="none" w:sz="4" w:space="0" w:color="B0C4DE"/>
-            </w:tcBorders>
-            <w:tcMar>
-              <w:top w:w="80" w:type="dxa"/>
-              <w:bottom w:w="80" w:type="dxa"/>
-              <w:left w:w="100" w:type="dxa"/>
-              <w:right w:w="100" w:type="dxa"/>
-            </w:tcMar>
+            <w:tcW w:type="dxa" w:w="2592"/>
           </w:tcPr>
           <w:p>
-            <w:pPr>
-              <w:spacing w:before="0" w:after="0" w:line="276" w:lineRule="auto"/>
-              <w:jc w:val="left"/>
-            </w:pPr>
             <w:r>
-              <w:rPr>
-                <w:rFonts w:ascii="Times New Roman" w:hAnsi="Times New Roman"/>
-                <w:sz w:val="20"/>
-              </w:rPr>
-              <w:t>USC02 - Đăng Nhập</w:t>
+              <w:t>USC02 &amp; USC14 - Quét mã QR &amp; Deep Link</w:t>
             </w:r>
           </w:p>
         </w:tc>
         <w:tc>
           <w:tcPr>
-            <w:tcW w:type="dxa" w:w="2268"/>
-            <w:shd w:fill="F8FAFC"/>
-            <w:tcBorders>
-              <w:top w:val="single" w:sz="4" w:space="0" w:color="B0C4DE"/>
-              <w:bottom w:val="single" w:sz="4" w:space="0" w:color="B0C4DE"/>
-              <w:left w:val="none" w:sz="4" w:space="0" w:color="B0C4DE"/>
-              <w:right w:val="none" w:sz="4" w:space="0" w:color="B0C4DE"/>
-            </w:tcBorders>
-            <w:tcMar>
-              <w:top w:w="80" w:type="dxa"/>
-              <w:bottom w:w="80" w:type="dxa"/>
-              <w:left w:w="100" w:type="dxa"/>
-              <w:right w:w="100" w:type="dxa"/>
-            </w:tcMar>
+            <w:tcW w:type="dxa" w:w="3168"/>
           </w:tcPr>
           <w:p>
-            <w:pPr>
-              <w:spacing w:before="0" w:after="0" w:line="276" w:lineRule="auto"/>
-              <w:jc w:val="left"/>
-            </w:pPr>
             <w:r>
-              <w:rPr>
-                <w:rFonts w:ascii="Times New Roman" w:hAnsi="Times New Roman"/>
-                <w:sz w:val="20"/>
-              </w:rPr>
-              <w:t>Đăng nhập với email Admin / User chuẩn</w:t>
+              <w:t>Giải mã QR URL: ?entry=gate, ?artifact=ART-001, mã trực tiếp</w:t>
             </w:r>
           </w:p>
         </w:tc>
         <w:tc>
           <w:tcPr>
-            <w:tcW w:type="dxa" w:w="2268"/>
-            <w:shd w:fill="F8FAFC"/>
-            <w:tcBorders>
-              <w:top w:val="single" w:sz="4" w:space="0" w:color="B0C4DE"/>
-              <w:bottom w:val="single" w:sz="4" w:space="0" w:color="B0C4DE"/>
-              <w:left w:val="none" w:sz="4" w:space="0" w:color="B0C4DE"/>
-              <w:right w:val="none" w:sz="4" w:space="0" w:color="B0C4DE"/>
-            </w:tcBorders>
-            <w:tcMar>
-              <w:top w:w="80" w:type="dxa"/>
-              <w:bottom w:w="80" w:type="dxa"/>
-              <w:left w:w="100" w:type="dxa"/>
-              <w:right w:w="100" w:type="dxa"/>
-            </w:tcMar>
+            <w:tcW w:type="dxa" w:w="1728"/>
           </w:tcPr>
           <w:p>
-            <w:pPr>
-              <w:spacing w:before="0" w:after="0" w:line="276" w:lineRule="auto"/>
-              <w:jc w:val="center"/>
-            </w:pPr>
             <w:r>
-              <w:rPr>
-                <w:rFonts w:ascii="Times New Roman" w:hAnsi="Times New Roman"/>
-                <w:b/>
-                <w:color w:val="228B22"/>
-                <w:sz w:val="20"/>
-              </w:rPr>
-              <w:t>Phân quyền đúng (PASS)</w:t>
+              <w:t>Nhận diện đúng mốc neo xuất phát (PASS) - 5 tests</w:t>
             </w:r>
           </w:p>
         </w:tc>
@@ -24587,127 +24065,41 @@
       <w:tr>
         <w:tc>
           <w:tcPr>
-            <w:tcW w:type="dxa" w:w="2268"/>
-            <w:shd w:fill="FFFFFF"/>
-            <w:tcBorders>
-              <w:top w:val="single" w:sz="4" w:space="0" w:color="B0C4DE"/>
-              <w:bottom w:val="single" w:sz="4" w:space="0" w:color="B0C4DE"/>
-              <w:left w:val="none" w:sz="4" w:space="0" w:color="B0C4DE"/>
-              <w:right w:val="none" w:sz="4" w:space="0" w:color="B0C4DE"/>
-            </w:tcBorders>
-            <w:tcMar>
-              <w:top w:w="80" w:type="dxa"/>
-              <w:bottom w:w="80" w:type="dxa"/>
-              <w:left w:w="100" w:type="dxa"/>
-              <w:right w:w="100" w:type="dxa"/>
-            </w:tcMar>
+            <w:tcW w:type="dxa" w:w="1584"/>
           </w:tcPr>
           <w:p>
-            <w:pPr>
-              <w:spacing w:before="0" w:after="0" w:line="276" w:lineRule="auto"/>
-              <w:jc w:val="center"/>
-            </w:pPr>
             <w:r>
-              <w:rPr>
-                <w:rFonts w:ascii="Times New Roman" w:hAnsi="Times New Roman"/>
-                <w:sz w:val="20"/>
-              </w:rPr>
               <w:t>TC_03</w:t>
             </w:r>
           </w:p>
         </w:tc>
         <w:tc>
           <w:tcPr>
-            <w:tcW w:type="dxa" w:w="2268"/>
-            <w:shd w:fill="FFFFFF"/>
-            <w:tcBorders>
-              <w:top w:val="single" w:sz="4" w:space="0" w:color="B0C4DE"/>
-              <w:bottom w:val="single" w:sz="4" w:space="0" w:color="B0C4DE"/>
-              <w:left w:val="none" w:sz="4" w:space="0" w:color="B0C4DE"/>
-              <w:right w:val="none" w:sz="4" w:space="0" w:color="B0C4DE"/>
-            </w:tcBorders>
-            <w:tcMar>
-              <w:top w:w="80" w:type="dxa"/>
-              <w:bottom w:w="80" w:type="dxa"/>
-              <w:left w:w="100" w:type="dxa"/>
-              <w:right w:w="100" w:type="dxa"/>
-            </w:tcMar>
+            <w:tcW w:type="dxa" w:w="2592"/>
           </w:tcPr>
           <w:p>
-            <w:pPr>
-              <w:spacing w:before="0" w:after="0" w:line="276" w:lineRule="auto"/>
-              <w:jc w:val="left"/>
-            </w:pPr>
             <w:r>
-              <w:rPr>
-                <w:rFonts w:ascii="Times New Roman" w:hAnsi="Times New Roman"/>
-                <w:sz w:val="20"/>
-              </w:rPr>
-              <w:t>USC03 - Quét QR</w:t>
+              <w:t>USC14 - Định vị GPS Haversine &amp; Vùng kích hoạt</w:t>
             </w:r>
           </w:p>
         </w:tc>
         <w:tc>
           <w:tcPr>
-            <w:tcW w:type="dxa" w:w="2268"/>
-            <w:shd w:fill="FFFFFF"/>
-            <w:tcBorders>
-              <w:top w:val="single" w:sz="4" w:space="0" w:color="B0C4DE"/>
-              <w:bottom w:val="single" w:sz="4" w:space="0" w:color="B0C4DE"/>
-              <w:left w:val="none" w:sz="4" w:space="0" w:color="B0C4DE"/>
-              <w:right w:val="none" w:sz="4" w:space="0" w:color="B0C4DE"/>
-            </w:tcBorders>
-            <w:tcMar>
-              <w:top w:w="80" w:type="dxa"/>
-              <w:bottom w:w="80" w:type="dxa"/>
-              <w:left w:w="100" w:type="dxa"/>
-              <w:right w:w="100" w:type="dxa"/>
-            </w:tcMar>
+            <w:tcW w:type="dxa" w:w="3168"/>
           </w:tcPr>
           <w:p>
-            <w:pPr>
-              <w:spacing w:before="0" w:after="0" w:line="276" w:lineRule="auto"/>
-              <w:jc w:val="left"/>
-            </w:pPr>
             <w:r>
-              <w:rPr>
-                <w:rFonts w:ascii="Times New Roman" w:hAnsi="Times New Roman"/>
-                <w:sz w:val="20"/>
-              </w:rPr>
-              <w:t>Quét mã hiện vật ART_art_001 qua camera</w:t>
+              <w:t>Tính khoảng cách Haversine, kích hoạt vùng 12m, chọn hiện vật gần nhất</w:t>
             </w:r>
           </w:p>
         </w:tc>
         <w:tc>
           <w:tcPr>
-            <w:tcW w:type="dxa" w:w="2268"/>
-            <w:shd w:fill="FFFFFF"/>
-            <w:tcBorders>
-              <w:top w:val="single" w:sz="4" w:space="0" w:color="B0C4DE"/>
-              <w:bottom w:val="single" w:sz="4" w:space="0" w:color="B0C4DE"/>
-              <w:left w:val="none" w:sz="4" w:space="0" w:color="B0C4DE"/>
-              <w:right w:val="none" w:sz="4" w:space="0" w:color="B0C4DE"/>
-            </w:tcBorders>
-            <w:tcMar>
-              <w:top w:w="80" w:type="dxa"/>
-              <w:bottom w:w="80" w:type="dxa"/>
-              <w:left w:w="100" w:type="dxa"/>
-              <w:right w:w="100" w:type="dxa"/>
-            </w:tcMar>
+            <w:tcW w:type="dxa" w:w="1728"/>
           </w:tcPr>
           <w:p>
-            <w:pPr>
-              <w:spacing w:before="0" w:after="0" w:line="276" w:lineRule="auto"/>
-              <w:jc w:val="center"/>
-            </w:pPr>
             <w:r>
-              <w:rPr>
-                <w:rFonts w:ascii="Times New Roman" w:hAnsi="Times New Roman"/>
-                <w:b/>
-                <w:color w:val="228B22"/>
-                <w:sz w:val="20"/>
-              </w:rPr>
-              <w:t>Nhận diện tức thì (PASS)</w:t>
+              <w:t>Tính toán sai số &lt; 0.1m, phát hiện chuẩn (PASS) - 7 tests</w:t>
             </w:r>
           </w:p>
         </w:tc>
@@ -24715,127 +24107,41 @@
       <w:tr>
         <w:tc>
           <w:tcPr>
-            <w:tcW w:type="dxa" w:w="2268"/>
-            <w:shd w:fill="F8FAFC"/>
-            <w:tcBorders>
-              <w:top w:val="single" w:sz="4" w:space="0" w:color="B0C4DE"/>
-              <w:bottom w:val="single" w:sz="4" w:space="0" w:color="B0C4DE"/>
-              <w:left w:val="none" w:sz="4" w:space="0" w:color="B0C4DE"/>
-              <w:right w:val="none" w:sz="4" w:space="0" w:color="B0C4DE"/>
-            </w:tcBorders>
-            <w:tcMar>
-              <w:top w:w="80" w:type="dxa"/>
-              <w:bottom w:w="80" w:type="dxa"/>
-              <w:left w:w="100" w:type="dxa"/>
-              <w:right w:w="100" w:type="dxa"/>
-            </w:tcMar>
+            <w:tcW w:type="dxa" w:w="1584"/>
           </w:tcPr>
           <w:p>
-            <w:pPr>
-              <w:spacing w:before="0" w:after="0" w:line="276" w:lineRule="auto"/>
-              <w:jc w:val="center"/>
-            </w:pPr>
             <w:r>
-              <w:rPr>
-                <w:rFonts w:ascii="Times New Roman" w:hAnsi="Times New Roman"/>
-                <w:sz w:val="20"/>
-              </w:rPr>
               <w:t>TC_04</w:t>
             </w:r>
           </w:p>
         </w:tc>
         <w:tc>
           <w:tcPr>
-            <w:tcW w:type="dxa" w:w="2268"/>
-            <w:shd w:fill="F8FAFC"/>
-            <w:tcBorders>
-              <w:top w:val="single" w:sz="4" w:space="0" w:color="B0C4DE"/>
-              <w:bottom w:val="single" w:sz="4" w:space="0" w:color="B0C4DE"/>
-              <w:left w:val="none" w:sz="4" w:space="0" w:color="B0C4DE"/>
-              <w:right w:val="none" w:sz="4" w:space="0" w:color="B0C4DE"/>
-            </w:tcBorders>
-            <w:tcMar>
-              <w:top w:w="80" w:type="dxa"/>
-              <w:bottom w:w="80" w:type="dxa"/>
-              <w:left w:w="100" w:type="dxa"/>
-              <w:right w:w="100" w:type="dxa"/>
-            </w:tcMar>
+            <w:tcW w:type="dxa" w:w="2592"/>
           </w:tcPr>
           <w:p>
-            <w:pPr>
-              <w:spacing w:before="0" w:after="0" w:line="276" w:lineRule="auto"/>
-              <w:jc w:val="left"/>
-            </w:pPr>
             <w:r>
-              <w:rPr>
-                <w:rFonts w:ascii="Times New Roman" w:hAnsi="Times New Roman"/>
-                <w:sz w:val="20"/>
-              </w:rPr>
-              <w:t>USC04 - Nghe Thuyết Minh</w:t>
+              <w:t>USC03 &amp; USC07 - Trình phát Audio &amp; Phụ đề</w:t>
             </w:r>
           </w:p>
         </w:tc>
         <w:tc>
           <w:tcPr>
-            <w:tcW w:type="dxa" w:w="2268"/>
-            <w:shd w:fill="F8FAFC"/>
-            <w:tcBorders>
-              <w:top w:val="single" w:sz="4" w:space="0" w:color="B0C4DE"/>
-              <w:bottom w:val="single" w:sz="4" w:space="0" w:color="B0C4DE"/>
-              <w:left w:val="none" w:sz="4" w:space="0" w:color="B0C4DE"/>
-              <w:right w:val="none" w:sz="4" w:space="0" w:color="B0C4DE"/>
-            </w:tcBorders>
-            <w:tcMar>
-              <w:top w:w="80" w:type="dxa"/>
-              <w:bottom w:w="80" w:type="dxa"/>
-              <w:left w:w="100" w:type="dxa"/>
-              <w:right w:w="100" w:type="dxa"/>
-            </w:tcMar>
+            <w:tcW w:type="dxa" w:w="3168"/>
           </w:tcPr>
           <w:p>
-            <w:pPr>
-              <w:spacing w:before="0" w:after="0" w:line="276" w:lineRule="auto"/>
-              <w:jc w:val="left"/>
-            </w:pPr>
             <w:r>
-              <w:rPr>
-                <w:rFonts w:ascii="Times New Roman" w:hAnsi="Times New Roman"/>
-                <w:sz w:val="20"/>
-              </w:rPr>
-              <w:t>Phát audio, tua thời gian, đổi tốc độ 1.25x</w:t>
+              <w:t>Phát MP3 audio, tua tiến độ, đồng bộ phụ đề Karaoke từng giây</w:t>
             </w:r>
           </w:p>
         </w:tc>
         <w:tc>
           <w:tcPr>
-            <w:tcW w:type="dxa" w:w="2268"/>
-            <w:shd w:fill="F8FAFC"/>
-            <w:tcBorders>
-              <w:top w:val="single" w:sz="4" w:space="0" w:color="B0C4DE"/>
-              <w:bottom w:val="single" w:sz="4" w:space="0" w:color="B0C4DE"/>
-              <w:left w:val="none" w:sz="4" w:space="0" w:color="B0C4DE"/>
-              <w:right w:val="none" w:sz="4" w:space="0" w:color="B0C4DE"/>
-            </w:tcBorders>
-            <w:tcMar>
-              <w:top w:w="80" w:type="dxa"/>
-              <w:bottom w:w="80" w:type="dxa"/>
-              <w:left w:w="100" w:type="dxa"/>
-              <w:right w:w="100" w:type="dxa"/>
-            </w:tcMar>
+            <w:tcW w:type="dxa" w:w="1728"/>
           </w:tcPr>
           <w:p>
-            <w:pPr>
-              <w:spacing w:before="0" w:after="0" w:line="276" w:lineRule="auto"/>
-              <w:jc w:val="center"/>
-            </w:pPr>
             <w:r>
-              <w:rPr>
-                <w:rFonts w:ascii="Times New Roman" w:hAnsi="Times New Roman"/>
-                <w:b/>
-                <w:color w:val="228B22"/>
-                <w:sz w:val="20"/>
-              </w:rPr>
-              <w:t>Âm thanh mượt mà (PASS)</w:t>
+              <w:t>Âm thanh chuẩn, phụ đề khớp mốc thời gian (PASS) - 4 tests</w:t>
             </w:r>
           </w:p>
         </w:tc>
@@ -24843,127 +24149,41 @@
       <w:tr>
         <w:tc>
           <w:tcPr>
-            <w:tcW w:type="dxa" w:w="2268"/>
-            <w:shd w:fill="FFFFFF"/>
-            <w:tcBorders>
-              <w:top w:val="single" w:sz="4" w:space="0" w:color="B0C4DE"/>
-              <w:bottom w:val="single" w:sz="4" w:space="0" w:color="B0C4DE"/>
-              <w:left w:val="none" w:sz="4" w:space="0" w:color="B0C4DE"/>
-              <w:right w:val="none" w:sz="4" w:space="0" w:color="B0C4DE"/>
-            </w:tcBorders>
-            <w:tcMar>
-              <w:top w:w="80" w:type="dxa"/>
-              <w:bottom w:w="80" w:type="dxa"/>
-              <w:left w:w="100" w:type="dxa"/>
-              <w:right w:w="100" w:type="dxa"/>
-            </w:tcMar>
+            <w:tcW w:type="dxa" w:w="1584"/>
           </w:tcPr>
           <w:p>
-            <w:pPr>
-              <w:spacing w:before="0" w:after="0" w:line="276" w:lineRule="auto"/>
-              <w:jc w:val="center"/>
-            </w:pPr>
             <w:r>
-              <w:rPr>
-                <w:rFonts w:ascii="Times New Roman" w:hAnsi="Times New Roman"/>
-                <w:sz w:val="20"/>
-              </w:rPr>
               <w:t>TC_05</w:t>
             </w:r>
           </w:p>
         </w:tc>
         <w:tc>
           <w:tcPr>
-            <w:tcW w:type="dxa" w:w="2268"/>
-            <w:shd w:fill="FFFFFF"/>
-            <w:tcBorders>
-              <w:top w:val="single" w:sz="4" w:space="0" w:color="B0C4DE"/>
-              <w:bottom w:val="single" w:sz="4" w:space="0" w:color="B0C4DE"/>
-              <w:left w:val="none" w:sz="4" w:space="0" w:color="B0C4DE"/>
-              <w:right w:val="none" w:sz="4" w:space="0" w:color="B0C4DE"/>
-            </w:tcBorders>
-            <w:tcMar>
-              <w:top w:w="80" w:type="dxa"/>
-              <w:bottom w:w="80" w:type="dxa"/>
-              <w:left w:w="100" w:type="dxa"/>
-              <w:right w:w="100" w:type="dxa"/>
-            </w:tcMar>
+            <w:tcW w:type="dxa" w:w="2592"/>
           </w:tcPr>
           <w:p>
-            <w:pPr>
-              <w:spacing w:before="0" w:after="0" w:line="276" w:lineRule="auto"/>
-              <w:jc w:val="left"/>
-            </w:pPr>
             <w:r>
-              <w:rPr>
-                <w:rFonts w:ascii="Times New Roman" w:hAnsi="Times New Roman"/>
-                <w:sz w:val="20"/>
-              </w:rPr>
-              <w:t>USC05 - Đổi Ngôn Ngữ</w:t>
+              <w:t>USC08 - Tìm Kiếm &amp; Tương tác giao diện</w:t>
             </w:r>
           </w:p>
         </w:tc>
         <w:tc>
           <w:tcPr>
-            <w:tcW w:type="dxa" w:w="2268"/>
-            <w:shd w:fill="FFFFFF"/>
-            <w:tcBorders>
-              <w:top w:val="single" w:sz="4" w:space="0" w:color="B0C4DE"/>
-              <w:bottom w:val="single" w:sz="4" w:space="0" w:color="B0C4DE"/>
-              <w:left w:val="none" w:sz="4" w:space="0" w:color="B0C4DE"/>
-              <w:right w:val="none" w:sz="4" w:space="0" w:color="B0C4DE"/>
-            </w:tcBorders>
-            <w:tcMar>
-              <w:top w:w="80" w:type="dxa"/>
-              <w:bottom w:w="80" w:type="dxa"/>
-              <w:left w:w="100" w:type="dxa"/>
-              <w:right w:w="100" w:type="dxa"/>
-            </w:tcMar>
+            <w:tcW w:type="dxa" w:w="3168"/>
           </w:tcPr>
           <w:p>
-            <w:pPr>
-              <w:spacing w:before="0" w:after="0" w:line="276" w:lineRule="auto"/>
-              <w:jc w:val="left"/>
-            </w:pPr>
             <w:r>
-              <w:rPr>
-                <w:rFonts w:ascii="Times New Roman" w:hAnsi="Times New Roman"/>
-                <w:sz w:val="20"/>
-              </w:rPr>
-              <w:t>Chuyển sang Tiếng Pháp và Tiếng Nhật</w:t>
+              <w:t>Tìm kiếm đa tiêu chí theo tên, mã số ART-xxx, mô tả tóm tắt</w:t>
             </w:r>
           </w:p>
         </w:tc>
         <w:tc>
           <w:tcPr>
-            <w:tcW w:type="dxa" w:w="2268"/>
-            <w:shd w:fill="FFFFFF"/>
-            <w:tcBorders>
-              <w:top w:val="single" w:sz="4" w:space="0" w:color="B0C4DE"/>
-              <w:bottom w:val="single" w:sz="4" w:space="0" w:color="B0C4DE"/>
-              <w:left w:val="none" w:sz="4" w:space="0" w:color="B0C4DE"/>
-              <w:right w:val="none" w:sz="4" w:space="0" w:color="B0C4DE"/>
-            </w:tcBorders>
-            <w:tcMar>
-              <w:top w:w="80" w:type="dxa"/>
-              <w:bottom w:w="80" w:type="dxa"/>
-              <w:left w:w="100" w:type="dxa"/>
-              <w:right w:w="100" w:type="dxa"/>
-            </w:tcMar>
+            <w:tcW w:type="dxa" w:w="1728"/>
           </w:tcPr>
           <w:p>
-            <w:pPr>
-              <w:spacing w:before="0" w:after="0" w:line="276" w:lineRule="auto"/>
-              <w:jc w:val="center"/>
-            </w:pPr>
             <w:r>
-              <w:rPr>
-                <w:rFonts w:ascii="Times New Roman" w:hAnsi="Times New Roman"/>
-                <w:b/>
-                <w:color w:val="228B22"/>
-                <w:sz w:val="20"/>
-              </w:rPr>
-              <w:t>Dữ liệu đổi ngay (PASS)</w:t>
+              <w:t>Lọc kết quả tức thời, click phát không lỗi (PASS) - 1 test</w:t>
             </w:r>
           </w:p>
         </w:tc>
@@ -24971,127 +24191,41 @@
       <w:tr>
         <w:tc>
           <w:tcPr>
-            <w:tcW w:type="dxa" w:w="2268"/>
-            <w:shd w:fill="F8FAFC"/>
-            <w:tcBorders>
-              <w:top w:val="single" w:sz="4" w:space="0" w:color="B0C4DE"/>
-              <w:bottom w:val="single" w:sz="4" w:space="0" w:color="B0C4DE"/>
-              <w:left w:val="none" w:sz="4" w:space="0" w:color="B0C4DE"/>
-              <w:right w:val="none" w:sz="4" w:space="0" w:color="B0C4DE"/>
-            </w:tcBorders>
-            <w:tcMar>
-              <w:top w:w="80" w:type="dxa"/>
-              <w:bottom w:w="80" w:type="dxa"/>
-              <w:left w:w="100" w:type="dxa"/>
-              <w:right w:w="100" w:type="dxa"/>
-            </w:tcMar>
+            <w:tcW w:type="dxa" w:w="1584"/>
           </w:tcPr>
           <w:p>
-            <w:pPr>
-              <w:spacing w:before="0" w:after="0" w:line="276" w:lineRule="auto"/>
-              <w:jc w:val="center"/>
-            </w:pPr>
             <w:r>
-              <w:rPr>
-                <w:rFonts w:ascii="Times New Roman" w:hAnsi="Times New Roman"/>
-                <w:sz w:val="20"/>
-              </w:rPr>
               <w:t>TC_06</w:t>
             </w:r>
           </w:p>
         </w:tc>
         <w:tc>
           <w:tcPr>
-            <w:tcW w:type="dxa" w:w="2268"/>
-            <w:shd w:fill="F8FAFC"/>
-            <w:tcBorders>
-              <w:top w:val="single" w:sz="4" w:space="0" w:color="B0C4DE"/>
-              <w:bottom w:val="single" w:sz="4" w:space="0" w:color="B0C4DE"/>
-              <w:left w:val="none" w:sz="4" w:space="0" w:color="B0C4DE"/>
-              <w:right w:val="none" w:sz="4" w:space="0" w:color="B0C4DE"/>
-            </w:tcBorders>
-            <w:tcMar>
-              <w:top w:w="80" w:type="dxa"/>
-              <w:bottom w:w="80" w:type="dxa"/>
-              <w:left w:w="100" w:type="dxa"/>
-              <w:right w:w="100" w:type="dxa"/>
-            </w:tcMar>
+            <w:tcW w:type="dxa" w:w="2592"/>
           </w:tcPr>
           <w:p>
-            <w:pPr>
-              <w:spacing w:before="0" w:after="0" w:line="276" w:lineRule="auto"/>
-              <w:jc w:val="left"/>
-            </w:pPr>
             <w:r>
-              <w:rPr>
-                <w:rFonts w:ascii="Times New Roman" w:hAnsi="Times New Roman"/>
-                <w:sz w:val="20"/>
-              </w:rPr>
-              <w:t>USC07 - Quản Lý Hiện Vật</w:t>
+              <w:t>USC04 - Chuyển đổi 5 Ngôn ngữ</w:t>
             </w:r>
           </w:p>
         </w:tc>
         <w:tc>
           <w:tcPr>
-            <w:tcW w:type="dxa" w:w="2268"/>
-            <w:shd w:fill="F8FAFC"/>
-            <w:tcBorders>
-              <w:top w:val="single" w:sz="4" w:space="0" w:color="B0C4DE"/>
-              <w:bottom w:val="single" w:sz="4" w:space="0" w:color="B0C4DE"/>
-              <w:left w:val="none" w:sz="4" w:space="0" w:color="B0C4DE"/>
-              <w:right w:val="none" w:sz="4" w:space="0" w:color="B0C4DE"/>
-            </w:tcBorders>
-            <w:tcMar>
-              <w:top w:w="80" w:type="dxa"/>
-              <w:bottom w:w="80" w:type="dxa"/>
-              <w:left w:w="100" w:type="dxa"/>
-              <w:right w:w="100" w:type="dxa"/>
-            </w:tcMar>
+            <w:tcW w:type="dxa" w:w="3168"/>
           </w:tcPr>
           <w:p>
-            <w:pPr>
-              <w:spacing w:before="0" w:after="0" w:line="276" w:lineRule="auto"/>
-              <w:jc w:val="left"/>
-            </w:pPr>
             <w:r>
-              <w:rPr>
-                <w:rFonts w:ascii="Times New Roman" w:hAnsi="Times New Roman"/>
-                <w:sz w:val="20"/>
-              </w:rPr>
-              <w:t>Admin tạo mới hiện vật 'Trống Đồng Đông Sơn'</w:t>
+              <w:t>Chuyển đổi giữa 5 thứ tiếng (vi, en, zh, ko, ja)</w:t>
             </w:r>
           </w:p>
         </w:tc>
         <w:tc>
           <w:tcPr>
-            <w:tcW w:type="dxa" w:w="2268"/>
-            <w:shd w:fill="F8FAFC"/>
-            <w:tcBorders>
-              <w:top w:val="single" w:sz="4" w:space="0" w:color="B0C4DE"/>
-              <w:bottom w:val="single" w:sz="4" w:space="0" w:color="B0C4DE"/>
-              <w:left w:val="none" w:sz="4" w:space="0" w:color="B0C4DE"/>
-              <w:right w:val="none" w:sz="4" w:space="0" w:color="B0C4DE"/>
-            </w:tcBorders>
-            <w:tcMar>
-              <w:top w:w="80" w:type="dxa"/>
-              <w:bottom w:w="80" w:type="dxa"/>
-              <w:left w:w="100" w:type="dxa"/>
-              <w:right w:w="100" w:type="dxa"/>
-            </w:tcMar>
+            <w:tcW w:type="dxa" w:w="1728"/>
           </w:tcPr>
           <w:p>
-            <w:pPr>
-              <w:spacing w:before="0" w:after="0" w:line="276" w:lineRule="auto"/>
-              <w:jc w:val="center"/>
-            </w:pPr>
             <w:r>
-              <w:rPr>
-                <w:rFonts w:ascii="Times New Roman" w:hAnsi="Times New Roman"/>
-                <w:b/>
-                <w:color w:val="228B22"/>
-                <w:sz w:val="20"/>
-              </w:rPr>
-              <w:t>Lưu CSDL chuẩn (PASS)</w:t>
+              <w:t>Toàn bộ giao diện và dữ liệu đổi ngay lập tức (PASS)</w:t>
             </w:r>
           </w:p>
         </w:tc>
@@ -25099,127 +24233,41 @@
       <w:tr>
         <w:tc>
           <w:tcPr>
-            <w:tcW w:type="dxa" w:w="2268"/>
-            <w:shd w:fill="FFFFFF"/>
-            <w:tcBorders>
-              <w:top w:val="single" w:sz="4" w:space="0" w:color="B0C4DE"/>
-              <w:bottom w:val="single" w:sz="4" w:space="0" w:color="B0C4DE"/>
-              <w:left w:val="none" w:sz="4" w:space="0" w:color="B0C4DE"/>
-              <w:right w:val="none" w:sz="4" w:space="0" w:color="B0C4DE"/>
-            </w:tcBorders>
-            <w:tcMar>
-              <w:top w:w="80" w:type="dxa"/>
-              <w:bottom w:w="80" w:type="dxa"/>
-              <w:left w:w="100" w:type="dxa"/>
-              <w:right w:w="100" w:type="dxa"/>
-            </w:tcMar>
+            <w:tcW w:type="dxa" w:w="1584"/>
           </w:tcPr>
           <w:p>
-            <w:pPr>
-              <w:spacing w:before="0" w:after="0" w:line="276" w:lineRule="auto"/>
-              <w:jc w:val="center"/>
-            </w:pPr>
             <w:r>
-              <w:rPr>
-                <w:rFonts w:ascii="Times New Roman" w:hAnsi="Times New Roman"/>
-                <w:sz w:val="20"/>
-              </w:rPr>
               <w:t>TC_07</w:t>
             </w:r>
           </w:p>
         </w:tc>
         <w:tc>
           <w:tcPr>
-            <w:tcW w:type="dxa" w:w="2268"/>
-            <w:shd w:fill="FFFFFF"/>
-            <w:tcBorders>
-              <w:top w:val="single" w:sz="4" w:space="0" w:color="B0C4DE"/>
-              <w:bottom w:val="single" w:sz="4" w:space="0" w:color="B0C4DE"/>
-              <w:left w:val="none" w:sz="4" w:space="0" w:color="B0C4DE"/>
-              <w:right w:val="none" w:sz="4" w:space="0" w:color="B0C4DE"/>
-            </w:tcBorders>
-            <w:tcMar>
-              <w:top w:w="80" w:type="dxa"/>
-              <w:bottom w:w="80" w:type="dxa"/>
-              <w:left w:w="100" w:type="dxa"/>
-              <w:right w:w="100" w:type="dxa"/>
-            </w:tcMar>
+            <w:tcW w:type="dxa" w:w="2592"/>
           </w:tcPr>
           <w:p>
-            <w:pPr>
-              <w:spacing w:before="0" w:after="0" w:line="276" w:lineRule="auto"/>
-              <w:jc w:val="left"/>
-            </w:pPr>
             <w:r>
-              <w:rPr>
-                <w:rFonts w:ascii="Times New Roman" w:hAnsi="Times New Roman"/>
-                <w:sz w:val="20"/>
-              </w:rPr>
-              <w:t>USC10 - Thống Kê</w:t>
+              <w:t>USC09 &amp; USC10 - Quản lý Hiện vật, Tọa độ &amp; QR</w:t>
             </w:r>
           </w:p>
         </w:tc>
         <w:tc>
           <w:tcPr>
-            <w:tcW w:type="dxa" w:w="2268"/>
-            <w:shd w:fill="FFFFFF"/>
-            <w:tcBorders>
-              <w:top w:val="single" w:sz="4" w:space="0" w:color="B0C4DE"/>
-              <w:bottom w:val="single" w:sz="4" w:space="0" w:color="B0C4DE"/>
-              <w:left w:val="none" w:sz="4" w:space="0" w:color="B0C4DE"/>
-              <w:right w:val="none" w:sz="4" w:space="0" w:color="B0C4DE"/>
-            </w:tcBorders>
-            <w:tcMar>
-              <w:top w:w="80" w:type="dxa"/>
-              <w:bottom w:w="80" w:type="dxa"/>
-              <w:left w:w="100" w:type="dxa"/>
-              <w:right w:w="100" w:type="dxa"/>
-            </w:tcMar>
+            <w:tcW w:type="dxa" w:w="3168"/>
           </w:tcPr>
           <w:p>
-            <w:pPr>
-              <w:spacing w:before="0" w:after="0" w:line="276" w:lineRule="auto"/>
-              <w:jc w:val="left"/>
-            </w:pPr>
             <w:r>
-              <w:rPr>
-                <w:rFonts w:ascii="Times New Roman" w:hAnsi="Times New Roman"/>
-                <w:sz w:val="20"/>
-              </w:rPr>
-              <w:t>Xem biểu đồ lượt nghe và xuất báo cáo</w:t>
+              <w:t>Thêm/sửa hiện vật, đổi bán kính 12m, xuất mã QR ca tham quan</w:t>
             </w:r>
           </w:p>
         </w:tc>
         <w:tc>
           <w:tcPr>
-            <w:tcW w:type="dxa" w:w="2268"/>
-            <w:shd w:fill="FFFFFF"/>
-            <w:tcBorders>
-              <w:top w:val="single" w:sz="4" w:space="0" w:color="B0C4DE"/>
-              <w:bottom w:val="single" w:sz="4" w:space="0" w:color="B0C4DE"/>
-              <w:left w:val="none" w:sz="4" w:space="0" w:color="B0C4DE"/>
-              <w:right w:val="none" w:sz="4" w:space="0" w:color="B0C4DE"/>
-            </w:tcBorders>
-            <w:tcMar>
-              <w:top w:w="80" w:type="dxa"/>
-              <w:bottom w:w="80" w:type="dxa"/>
-              <w:left w:w="100" w:type="dxa"/>
-              <w:right w:w="100" w:type="dxa"/>
-            </w:tcMar>
+            <w:tcW w:type="dxa" w:w="1728"/>
           </w:tcPr>
           <w:p>
-            <w:pPr>
-              <w:spacing w:before="0" w:after="0" w:line="276" w:lineRule="auto"/>
-              <w:jc w:val="center"/>
-            </w:pPr>
             <w:r>
-              <w:rPr>
-                <w:rFonts w:ascii="Times New Roman" w:hAnsi="Times New Roman"/>
-                <w:b/>
-                <w:color w:val="228B22"/>
-                <w:sz w:val="20"/>
-              </w:rPr>
-              <w:t>Biểu đồ trực quan (PASS)</w:t>
+              <w:t>Lưu trữ CSDL chuẩn, sinh mã QR hợp lệ (PASS)</w:t>
             </w:r>
           </w:p>
         </w:tc>

</xml_diff>